<commit_message>
Fixed some errors in theory , completed rest position and theoretical inverse kinematics in Arduino
</commit_message>
<xml_diff>
--- a/KinematicsAndCoordinates/kinematcis_coordinates.docx
+++ b/KinematicsAndCoordinates/kinematcis_coordinates.docx
@@ -527,7 +527,7 @@
       </w:pPr>
       <w:r>
         <w:rPr/>
-        <w:t>x′ = x − L₃ cosφ</w:t>
+        <w:t>x′ = x − L₃ cosφ=x+L3</w:t>
       </w:r>
     </w:p>
     <w:p>
@@ -537,7 +537,7 @@
       </w:pPr>
       <w:r>
         <w:rPr/>
-        <w:t>y′ = y − L₃ sinφ</w:t>
+        <w:t>y′ = y − L₃ sinφ=y</w:t>
       </w:r>
     </w:p>
     <w:p>
@@ -759,8 +759,99 @@
       </w:pPr>
       <w:r>
         <w:rPr/>
-        <w:t>r = √(x′² + y′²)</w:t>
-      </w:r>
+        <w:t>r = √(x′² + y′²),</w:t>
+      </w:r>
+      <w:r>
+        <w:rPr/>
+      </w:r>
+      <m:oMath xmlns:m="http://schemas.openxmlformats.org/officeDocument/2006/math">
+        <m:d>
+          <m:dPr>
+            <m:begChr m:val="|"/>
+            <m:endChr m:val="|"/>
+          </m:dPr>
+          <m:e>
+            <m:r>
+              <w:rPr>
+                <w:rFonts w:ascii="Cambria Math" w:hAnsi="Cambria Math"/>
+              </w:rPr>
+              <m:t xml:space="preserve">L</m:t>
+            </m:r>
+            <m:r>
+              <w:rPr>
+                <w:rFonts w:ascii="Cambria Math" w:hAnsi="Cambria Math"/>
+              </w:rPr>
+              <m:t xml:space="preserve">1</m:t>
+            </m:r>
+            <m:r>
+              <w:rPr>
+                <w:rFonts w:ascii="Cambria Math" w:hAnsi="Cambria Math"/>
+              </w:rPr>
+              <m:t xml:space="preserve">−</m:t>
+            </m:r>
+            <m:r>
+              <w:rPr>
+                <w:rFonts w:ascii="Cambria Math" w:hAnsi="Cambria Math"/>
+              </w:rPr>
+              <m:t xml:space="preserve">L</m:t>
+            </m:r>
+            <m:r>
+              <w:rPr>
+                <w:rFonts w:ascii="Cambria Math" w:hAnsi="Cambria Math"/>
+              </w:rPr>
+              <m:t xml:space="preserve">2</m:t>
+            </m:r>
+          </m:e>
+        </m:d>
+        <m:r>
+          <w:rPr>
+            <w:rFonts w:ascii="Cambria Math" w:hAnsi="Cambria Math"/>
+          </w:rPr>
+          <m:t xml:space="preserve">≤</m:t>
+        </m:r>
+        <m:r>
+          <w:rPr>
+            <w:rFonts w:ascii="Cambria Math" w:hAnsi="Cambria Math"/>
+          </w:rPr>
+          <m:t xml:space="preserve">r</m:t>
+        </m:r>
+        <m:r>
+          <w:rPr>
+            <w:rFonts w:ascii="Cambria Math" w:hAnsi="Cambria Math"/>
+          </w:rPr>
+          <m:t xml:space="preserve">≤</m:t>
+        </m:r>
+        <m:r>
+          <w:rPr>
+            <w:rFonts w:ascii="Cambria Math" w:hAnsi="Cambria Math"/>
+          </w:rPr>
+          <m:t xml:space="preserve">L</m:t>
+        </m:r>
+        <m:r>
+          <w:rPr>
+            <w:rFonts w:ascii="Cambria Math" w:hAnsi="Cambria Math"/>
+          </w:rPr>
+          <m:t xml:space="preserve">1</m:t>
+        </m:r>
+        <m:r>
+          <w:rPr>
+            <w:rFonts w:ascii="Cambria Math" w:hAnsi="Cambria Math"/>
+          </w:rPr>
+          <m:t xml:space="preserve">+</m:t>
+        </m:r>
+        <m:r>
+          <w:rPr>
+            <w:rFonts w:ascii="Cambria Math" w:hAnsi="Cambria Math"/>
+          </w:rPr>
+          <m:t xml:space="preserve">L</m:t>
+        </m:r>
+        <m:r>
+          <w:rPr>
+            <w:rFonts w:ascii="Cambria Math" w:hAnsi="Cambria Math"/>
+          </w:rPr>
+          <m:t xml:space="preserve">2</m:t>
+        </m:r>
+      </m:oMath>
     </w:p>
     <w:p>
       <w:pPr>
@@ -1230,7 +1321,7 @@
                 <wp:positionV relativeFrom="paragraph">
                   <wp:posOffset>57150</wp:posOffset>
                 </wp:positionV>
-                <wp:extent cx="3749675" cy="6055995"/>
+                <wp:extent cx="3748405" cy="6054725"/>
                 <wp:effectExtent l="0" t="0" r="0" b="0"/>
                 <wp:wrapNone/>
                 <wp:docPr id="3" name="Group object 1"/>
@@ -1241,9 +1332,9 @@
                       <wpg:grpSpPr>
                         <a:xfrm>
                           <a:off x="0" y="0"/>
-                          <a:ext cx="3749760" cy="6055920"/>
+                          <a:ext cx="3748320" cy="6054840"/>
                           <a:chOff x="0" y="0"/>
-                          <a:chExt cx="3749760" cy="6055920"/>
+                          <a:chExt cx="3748320" cy="6054840"/>
                         </a:xfrm>
                       </wpg:grpSpPr>
                       <pic:pic xmlns:pic="http://schemas.openxmlformats.org/drawingml/2006/picture">
@@ -1258,7 +1349,7 @@
                         <pic:spPr>
                           <a:xfrm>
                             <a:off x="546120" y="0"/>
-                            <a:ext cx="3175560" cy="2912040"/>
+                            <a:ext cx="3174480" cy="2910960"/>
                           </a:xfrm>
                           <a:prstGeom prst="rect">
                             <a:avLst/>
@@ -1280,7 +1371,7 @@
                         <pic:spPr>
                           <a:xfrm>
                             <a:off x="0" y="1440"/>
-                            <a:ext cx="459720" cy="2910960"/>
+                            <a:ext cx="458640" cy="2909520"/>
                           </a:xfrm>
                           <a:prstGeom prst="rect">
                             <a:avLst/>
@@ -1302,7 +1393,7 @@
                         <pic:spPr>
                           <a:xfrm>
                             <a:off x="561240" y="2959200"/>
-                            <a:ext cx="3188160" cy="364320"/>
+                            <a:ext cx="3187080" cy="363240"/>
                           </a:xfrm>
                           <a:prstGeom prst="rect">
                             <a:avLst/>
@@ -1371,7 +1462,7 @@
                         <wps:spPr>
                           <a:xfrm>
                             <a:off x="650160" y="2682720"/>
-                            <a:ext cx="141120" cy="113760"/>
+                            <a:ext cx="139680" cy="112320"/>
                           </a:xfrm>
                           <a:prstGeom prst="ellipse">
                             <a:avLst/>
@@ -1423,7 +1514,7 @@
                         <wps:spPr>
                           <a:xfrm>
                             <a:off x="6480" y="3381480"/>
-                            <a:ext cx="1643400" cy="2674800"/>
+                            <a:ext cx="1641960" cy="2673360"/>
                           </a:xfrm>
                           <a:prstGeom prst="rect">
                             <a:avLst/>
@@ -1473,7 +1564,7 @@
                             </w:p>
                           </w:txbxContent>
                         </wps:txbx>
-                        <wps:bodyPr lIns="90000" rIns="90000" tIns="434520" bIns="434520" anchor="t">
+                        <wps:bodyPr lIns="90000" rIns="90000" tIns="2674800" bIns="2674800" anchor="t">
                           <a:noAutofit/>
                         </wps:bodyPr>
                       </wps:wsp>
@@ -1485,7 +1576,7 @@
           </mc:Choice>
           <mc:Fallback>
             <w:pict>
-              <v:group id="shape_0" alt="Group object 1" style="position:absolute;margin-left:259.8pt;margin-top:4.5pt;width:295.25pt;height:476.9pt" coordorigin="5196,90" coordsize="5905,9538">
+              <v:group id="shape_0" alt="Group object 1" style="position:absolute;margin-left:259.8pt;margin-top:4.5pt;width:295.15pt;height:476.75pt" coordorigin="5196,90" coordsize="5903,9535">
                 <v:shapetype id="_x0000_t75" coordsize="21600,21600" o:spt="75" o:preferrelative="t" path="m@4@5l@4@11@9@11@9@5xe" filled="f" stroked="f">
                   <v:stroke joinstyle="miter"/>
                   <v:formulas>
@@ -1505,17 +1596,17 @@
                   <v:path o:extrusionok="f" gradientshapeok="t" o:connecttype="rect"/>
                   <o:lock v:ext="edit" aspectratio="t"/>
                 </v:shapetype>
-                <v:shape id="shape_0" stroked="f" o:allowincell="f" style="position:absolute;left:6056;top:90;width:5000;height:4585;mso-wrap-style:none;v-text-anchor:middle" type="_x0000_t75">
+                <v:shape id="shape_0" stroked="f" o:allowincell="f" style="position:absolute;left:6056;top:90;width:4998;height:4583;mso-wrap-style:none;v-text-anchor:middle" type="_x0000_t75">
                   <v:imagedata r:id="rId4" o:detectmouseclick="t"/>
                   <v:stroke color="#3465a4" joinstyle="round" endcap="flat"/>
                   <w10:wrap type="none"/>
                 </v:shape>
-                <v:shape id="shape_0" stroked="f" o:allowincell="f" style="position:absolute;left:5196;top:92;width:723;height:4583;mso-wrap-style:none;v-text-anchor:middle" type="_x0000_t75">
+                <v:shape id="shape_0" stroked="f" o:allowincell="f" style="position:absolute;left:5196;top:92;width:721;height:4581;mso-wrap-style:none;v-text-anchor:middle" type="_x0000_t75">
                   <v:imagedata r:id="rId5" o:detectmouseclick="t"/>
                   <v:stroke color="#3465a4" joinstyle="round" endcap="flat"/>
                   <w10:wrap type="none"/>
                 </v:shape>
-                <v:shape id="shape_0" stroked="f" o:allowincell="f" style="position:absolute;left:6080;top:4750;width:5020;height:573;mso-wrap-style:none;v-text-anchor:middle" type="_x0000_t75">
+                <v:shape id="shape_0" stroked="f" o:allowincell="f" style="position:absolute;left:6080;top:4750;width:5018;height:571;mso-wrap-style:none;v-text-anchor:middle" type="_x0000_t75">
                   <v:imagedata r:id="rId6" o:detectmouseclick="t"/>
                   <v:stroke color="#3465a4" joinstyle="round" endcap="flat"/>
                   <w10:wrap type="none"/>
@@ -1530,7 +1621,7 @@
                   <v:fill o:detectmouseclick="t" on="false"/>
                   <w10:wrap type="none"/>
                 </v:line>
-                <v:oval id="shape_0" path="l-2147483648,-2147483643l-2147483628,-2147483627l-2147483648,-2147483643l-2147483626,-2147483625xe" fillcolor="black" stroked="t" o:allowincell="f" style="position:absolute;left:6220;top:4315;width:221;height:178;mso-wrap-style:none;v-text-anchor:middle">
+                <v:oval id="shape_0" path="l-2147483648,-2147483643l-2147483628,-2147483627l-2147483648,-2147483643l-2147483626,-2147483625xe" fillcolor="black" stroked="t" o:allowincell="f" style="position:absolute;left:6220;top:4315;width:219;height:176;mso-wrap-style:none;v-text-anchor:middle">
                   <v:fill o:detectmouseclick="t" type="solid" color2="white"/>
                   <v:stroke color="#3465a4" joinstyle="round" endcap="flat"/>
                   <w10:wrap type="none"/>
@@ -1540,7 +1631,7 @@
                   <v:fill o:detectmouseclick="t" on="false"/>
                   <w10:wrap type="none"/>
                 </v:line>
-                <v:rect id="shape_0" path="m0,0l-2147483645,0l-2147483645,-2147483646l0,-2147483646xe" stroked="f" o:allowincell="f" style="position:absolute;left:5206;top:5415;width:2587;height:4211;mso-wrap-style:square;v-text-anchor:top">
+                <v:rect id="shape_0" path="m0,0l-2147483645,0l-2147483645,-2147483646l0,-2147483646xe" stroked="f" o:allowincell="f" style="position:absolute;left:5206;top:5415;width:2585;height:4209;mso-wrap-style:square;v-text-anchor:top">
                   <v:textbox>
                     <w:txbxContent>
                       <w:p>
@@ -4064,7 +4155,7 @@
           <w:szCs w:val="22"/>
           <w:lang w:val="en-US" w:eastAsia="en-US" w:bidi="ar-SA"/>
         </w:rPr>
-        <w:t>c4e5→ c4: x=(-2)*3.065,y=3*3.065</w:t>
+        <w:t>c4e5→ c4: x=(-2)*3.065,y=3*3.0625</w:t>
       </w:r>
     </w:p>
     <w:p>
@@ -4093,7 +4184,7 @@
           <w:szCs w:val="22"/>
           <w:lang w:val="en-US" w:eastAsia="en-US" w:bidi="ar-SA"/>
         </w:rPr>
-        <w:t>e5: x=0*3.065, y=4*3.065</w:t>
+        <w:t>e5: x=0*3.065, y=4*3.0625</w:t>
       </w:r>
     </w:p>
     <w:p>
@@ -4207,7 +4298,7 @@
           <w:vertAlign w:val="baseline"/>
           <w:lang w:val="en-US" w:eastAsia="en-US" w:bidi="ar-SA"/>
         </w:rPr>
-        <w:t>=2*3.065 και d</w:t>
+        <w:t>=2*3.0625 και d</w:t>
       </w:r>
       <w:r>
         <w:rPr>
@@ -4285,7 +4376,7 @@
           <w:vertAlign w:val="baseline"/>
           <w:lang w:val="en-US" w:eastAsia="en-US" w:bidi="ar-SA"/>
         </w:rPr>
-        <w:t>=1*3.065</w:t>
+        <w:t>=1*3.0625</w:t>
       </w:r>
     </w:p>
     <w:p>
@@ -4466,7 +4557,15 @@
         </w:rPr>
       </w:pPr>
       <w:r>
-        <w:rPr/>
+        <w:rPr>
+          <w:rFonts w:eastAsia="Arial" w:cs="" w:cstheme="minorBidi"/>
+          <w:color w:val="auto"/>
+          <w:kern w:val="0"/>
+          <w:sz w:val="24"/>
+          <w:szCs w:val="22"/>
+          <w:vertAlign w:val="subscript"/>
+          <w:lang w:val="en-US" w:eastAsia="en-US" w:bidi="ar-SA"/>
+        </w:rPr>
       </w:r>
     </w:p>
     <w:p>
@@ -4513,41 +4612,7 @@
           <w:vertAlign w:val="baseline"/>
           <w:lang w:val="en-US" w:eastAsia="en-US" w:bidi="ar-SA"/>
         </w:rPr>
-        <w:t xml:space="preserve">ύρεση γωνίας ω για την </w:t>
-      </w:r>
-      <w:r>
-        <w:rPr>
-          <w:rFonts w:eastAsia="Arial" w:cs="" w:cstheme="minorBidi"/>
-          <w:b/>
-          <w:bCs/>
-          <w:color w:val="2A6099"/>
-          <w:kern w:val="0"/>
-          <w:position w:val="0"/>
-          <w:sz w:val="40"/>
-          <w:sz w:val="40"/>
-          <w:szCs w:val="40"/>
-          <w:u w:val="single"/>
-          <w:vertAlign w:val="baseline"/>
-          <w:lang w:val="en-US" w:eastAsia="en-US" w:bidi="ar-SA"/>
-        </w:rPr>
-        <w:t>περιστροφή</w:t>
-      </w:r>
-      <w:r>
-        <w:rPr>
-          <w:rFonts w:eastAsia="Arial" w:cs="" w:cstheme="minorBidi"/>
-          <w:b/>
-          <w:bCs/>
-          <w:color w:val="2A6099"/>
-          <w:kern w:val="0"/>
-          <w:position w:val="0"/>
-          <w:sz w:val="40"/>
-          <w:sz w:val="40"/>
-          <w:szCs w:val="40"/>
-          <w:u w:val="single"/>
-          <w:vertAlign w:val="baseline"/>
-          <w:lang w:val="en-US" w:eastAsia="en-US" w:bidi="ar-SA"/>
-        </w:rPr>
-        <w:t xml:space="preserve"> του</w:t>
+        <w:t>ύρεση γωνίας ω για την περιστροφή του</w:t>
       </w:r>
     </w:p>
     <w:p>
@@ -4604,7 +4669,7 @@
         <mc:AlternateContent>
           <mc:Choice Requires="wpg">
             <w:drawing>
-              <wp:anchor behindDoc="0" distT="0" distB="0" distL="0" distR="0" simplePos="0" locked="0" layoutInCell="0" allowOverlap="1" relativeHeight="7">
+              <wp:anchor behindDoc="0" distT="635" distB="635" distL="635" distR="635" simplePos="0" locked="0" layoutInCell="0" allowOverlap="1" relativeHeight="7">
                 <wp:simplePos x="0" y="0"/>
                 <wp:positionH relativeFrom="column">
                   <wp:posOffset>870585</wp:posOffset>
@@ -4657,7 +4722,7 @@
                         <wps:spPr>
                           <a:xfrm>
                             <a:off x="1991880" y="3535200"/>
-                            <a:ext cx="379080" cy="392400"/>
+                            <a:ext cx="378000" cy="391320"/>
                           </a:xfrm>
                           <a:prstGeom prst="ellipse">
                             <a:avLst/>
@@ -4684,7 +4749,7 @@
                         <wps:spPr>
                           <a:xfrm>
                             <a:off x="569520" y="981720"/>
-                            <a:ext cx="473760" cy="393120"/>
+                            <a:ext cx="472320" cy="391680"/>
                           </a:xfrm>
                           <a:prstGeom prst="rect">
                             <a:avLst/>
@@ -4711,7 +4776,7 @@
                         <wps:spPr>
                           <a:xfrm>
                             <a:off x="3129840" y="1767960"/>
-                            <a:ext cx="474840" cy="392400"/>
+                            <a:ext cx="473760" cy="391320"/>
                           </a:xfrm>
                           <a:prstGeom prst="rect">
                             <a:avLst/>
@@ -4788,7 +4853,7 @@
                         <wps:spPr>
                           <a:xfrm>
                             <a:off x="2181960" y="0"/>
-                            <a:ext cx="0" cy="6972480"/>
+                            <a:ext cx="720" cy="6972480"/>
                           </a:xfrm>
                           <a:prstGeom prst="line">
                             <a:avLst/>
@@ -4815,13 +4880,13 @@
                         <wps:spPr>
                           <a:xfrm>
                             <a:off x="1927800" y="3069720"/>
-                            <a:ext cx="283320" cy="184320"/>
+                            <a:ext cx="281880" cy="182880"/>
                           </a:xfrm>
                           <a:custGeom>
                             <a:avLst/>
                             <a:gdLst/>
                             <a:ahLst/>
-                            <a:rect l="0" t="0" r="r" b="b"/>
+                            <a:rect l="l" t="t" r="r" b="b"/>
                             <a:pathLst>
                               <a:path fill="none" w="787" h="512">
                                 <a:moveTo>
@@ -4835,12 +4900,19 @@
                               </a:path>
                             </a:pathLst>
                           </a:custGeom>
+                          <a:noFill/>
                           <a:ln w="0">
                             <a:solidFill>
                               <a:srgbClr val="3465a4"/>
                             </a:solidFill>
                           </a:ln>
                         </wps:spPr>
+                        <wps:style>
+                          <a:lnRef idx="0"/>
+                          <a:fillRef idx="0"/>
+                          <a:effectRef idx="0"/>
+                          <a:fontRef idx="minor"/>
+                        </wps:style>
                         <wps:bodyPr/>
                       </wps:wsp>
                       <wps:wsp>
@@ -4848,13 +4920,13 @@
                         <wps:spPr>
                           <a:xfrm>
                             <a:off x="2187000" y="3189600"/>
-                            <a:ext cx="342360" cy="162000"/>
+                            <a:ext cx="340920" cy="160560"/>
                           </a:xfrm>
                           <a:custGeom>
                             <a:avLst/>
                             <a:gdLst/>
                             <a:ahLst/>
-                            <a:rect l="0" t="0" r="r" b="b"/>
+                            <a:rect l="l" t="t" r="r" b="b"/>
                             <a:pathLst>
                               <a:path fill="none" w="951" h="450">
                                 <a:moveTo>
@@ -4871,12 +4943,19 @@
                               </a:path>
                             </a:pathLst>
                           </a:custGeom>
+                          <a:noFill/>
                           <a:ln w="0">
                             <a:solidFill>
                               <a:srgbClr val="3465a4"/>
                             </a:solidFill>
                           </a:ln>
                         </wps:spPr>
+                        <wps:style>
+                          <a:lnRef idx="0"/>
+                          <a:fillRef idx="0"/>
+                          <a:effectRef idx="0"/>
+                          <a:fontRef idx="minor"/>
+                        </wps:style>
                         <wps:bodyPr/>
                       </wps:wsp>
                       <wps:wsp>
@@ -4911,7 +4990,7 @@
                         <wps:spPr>
                           <a:xfrm flipH="1">
                             <a:off x="2181960" y="1964160"/>
-                            <a:ext cx="1232640" cy="0"/>
+                            <a:ext cx="1232640" cy="720"/>
                           </a:xfrm>
                           <a:prstGeom prst="line">
                             <a:avLst/>
@@ -4934,11 +5013,11 @@
                         <wps:bodyPr/>
                       </wps:wsp>
                       <wps:wsp>
-                        <wps:cNvSpPr txBox="1"/>
+                        <wps:cNvSpPr/>
                         <wps:spPr>
                           <a:xfrm>
                             <a:off x="1897560" y="2847240"/>
-                            <a:ext cx="94680" cy="675720"/>
+                            <a:ext cx="93240" cy="674280"/>
                           </a:xfrm>
                           <a:prstGeom prst="rect">
                             <a:avLst/>
@@ -4948,52 +5027,56 @@
                             <a:noFill/>
                           </a:ln>
                         </wps:spPr>
+                        <wps:style>
+                          <a:lnRef idx="0"/>
+                          <a:fillRef idx="0"/>
+                          <a:effectRef idx="0"/>
+                          <a:fontRef idx="minor"/>
+                        </wps:style>
                         <wps:txbx>
                           <w:txbxContent>
                             <w:p>
                               <w:pPr>
                                 <w:overflowPunct w:val="false"/>
                                 <w:spacing w:before="0" w:after="0" w:lineRule="auto" w:line="240"/>
-                                <w:ind w:left="0" w:right="0" w:hanging="0"/>
+                                <w:jc w:val="left"/>
                                 <w:rPr/>
                               </w:pPr>
                               <w:r>
                                 <w:rPr>
+                                  <w:smallCaps w:val="false"/>
+                                  <w:caps w:val="false"/>
+                                  <w:iCs w:val="false"/>
+                                  <w:bCs w:val="false"/>
+                                  <w:szCs w:val="36"/>
+                                  <w:spacing w:val="0"/>
+                                  <w:vertAlign w:val="baseline"/>
+                                  <w:position w:val="0"/>
                                   <w:sz w:val="36"/>
-                                  <w:b w:val="false"/>
-                                  <w:u w:val="none"/>
+                                  <w:i w:val="false"/>
                                   <w:dstrike w:val="false"/>
                                   <w:strike w:val="false"/>
-                                  <w:i w:val="false"/>
-                                  <w:outline w:val="false"/>
-                                  <w:shadow w:val="false"/>
-                                  <w:kern w:val="2"/>
-                                  <w:szCs w:val="36"/>
-                                  <w:bCs w:val="false"/>
-                                  <w:iCs w:val="false"/>
-                                  <w:em w:val="none"/>
-                                  <w:emboss w:val="false"/>
-                                  <w:imprint w:val="false"/>
-                                  <w:smallCaps w:val="false"/>
-                                  <w:caps w:val="false"/>
-                                  <w:rFonts w:asciiTheme="minorHAnsi" w:cstheme="minorBidi" w:eastAsiaTheme="minorEastAsia" w:hAnsiTheme="minorHAnsi" w:ascii="Liberation Sans" w:hAnsi="Liberation Sans" w:eastAsia="Noto Sans CJK SC" w:cs="FreeSans"/>
-                                  <w:color w:val="auto"/>
+                                  <w:u w:val="none"/>
+                                  <w:b w:val="false"/>
+                                  <w:sz w:val="36"/>
+                                  <w:rFonts w:asciiTheme="minorHAnsi" w:cstheme="minorBidi" w:eastAsiaTheme="minorEastAsia" w:hAnsiTheme="minorHAnsi" w:eastAsia="Noto Sans CJK SC" w:cs="FreeSans" w:ascii="Liberation Sans" w:hAnsi="Liberation Sans"/>
+                                  <w:color w:val="00000A"/>
                                 </w:rPr>
                                 <w:t>ω</w:t>
                               </w:r>
                             </w:p>
                           </w:txbxContent>
                         </wps:txbx>
-                        <wps:bodyPr wrap="square" lIns="90000" rIns="90000" tIns="45000" bIns="45000" anchor="t">
+                        <wps:bodyPr lIns="90000" rIns="90000" tIns="279360" bIns="279360" anchor="t">
                           <a:noAutofit/>
                         </wps:bodyPr>
                       </wps:wsp>
                       <wps:wsp>
-                        <wps:cNvSpPr txBox="1"/>
+                        <wps:cNvSpPr/>
                         <wps:spPr>
                           <a:xfrm>
                             <a:off x="2276640" y="2847240"/>
-                            <a:ext cx="189360" cy="675720"/>
+                            <a:ext cx="187920" cy="674280"/>
                           </a:xfrm>
                           <a:prstGeom prst="rect">
                             <a:avLst/>
@@ -5003,52 +5086,56 @@
                             <a:noFill/>
                           </a:ln>
                         </wps:spPr>
+                        <wps:style>
+                          <a:lnRef idx="0"/>
+                          <a:fillRef idx="0"/>
+                          <a:effectRef idx="0"/>
+                          <a:fontRef idx="minor"/>
+                        </wps:style>
                         <wps:txbx>
                           <w:txbxContent>
                             <w:p>
                               <w:pPr>
                                 <w:overflowPunct w:val="false"/>
                                 <w:spacing w:before="0" w:after="0" w:lineRule="auto" w:line="240"/>
-                                <w:ind w:left="0" w:right="0" w:hanging="0"/>
+                                <w:jc w:val="left"/>
                                 <w:rPr/>
                               </w:pPr>
                               <w:r>
                                 <w:rPr>
+                                  <w:smallCaps w:val="false"/>
+                                  <w:caps w:val="false"/>
+                                  <w:iCs w:val="false"/>
+                                  <w:bCs w:val="false"/>
+                                  <w:szCs w:val="36"/>
+                                  <w:spacing w:val="0"/>
+                                  <w:vertAlign w:val="baseline"/>
+                                  <w:position w:val="0"/>
                                   <w:sz w:val="36"/>
-                                  <w:b w:val="false"/>
-                                  <w:u w:val="none"/>
+                                  <w:i w:val="false"/>
                                   <w:dstrike w:val="false"/>
                                   <w:strike w:val="false"/>
-                                  <w:i w:val="false"/>
-                                  <w:outline w:val="false"/>
-                                  <w:shadow w:val="false"/>
-                                  <w:kern w:val="2"/>
-                                  <w:szCs w:val="36"/>
-                                  <w:bCs w:val="false"/>
-                                  <w:iCs w:val="false"/>
-                                  <w:em w:val="none"/>
-                                  <w:emboss w:val="false"/>
-                                  <w:imprint w:val="false"/>
-                                  <w:smallCaps w:val="false"/>
-                                  <w:caps w:val="false"/>
-                                  <w:rFonts w:asciiTheme="minorHAnsi" w:cstheme="minorBidi" w:eastAsiaTheme="minorEastAsia" w:hAnsiTheme="minorHAnsi" w:ascii="Liberation Sans" w:hAnsi="Liberation Sans" w:eastAsia="Noto Sans CJK SC" w:cs="FreeSans"/>
-                                  <w:color w:val="auto"/>
+                                  <w:u w:val="none"/>
+                                  <w:b w:val="false"/>
+                                  <w:sz w:val="36"/>
+                                  <w:rFonts w:asciiTheme="minorHAnsi" w:cstheme="minorBidi" w:eastAsiaTheme="minorEastAsia" w:hAnsiTheme="minorHAnsi" w:eastAsia="Noto Sans CJK SC" w:cs="FreeSans" w:ascii="Liberation Sans" w:hAnsi="Liberation Sans"/>
+                                  <w:color w:val="00000A"/>
                                 </w:rPr>
                                 <w:t>ω</w:t>
                               </w:r>
                             </w:p>
                           </w:txbxContent>
                         </wps:txbx>
-                        <wps:bodyPr wrap="square" lIns="90000" rIns="90000" tIns="45000" bIns="45000" anchor="t">
+                        <wps:bodyPr lIns="90000" rIns="90000" tIns="279360" bIns="279360" anchor="t">
                           <a:noAutofit/>
                         </wps:bodyPr>
                       </wps:wsp>
                       <wps:wsp>
-                        <wps:cNvSpPr txBox="1"/>
+                        <wps:cNvSpPr/>
                         <wps:spPr>
                           <a:xfrm>
                             <a:off x="2276640" y="2455560"/>
-                            <a:ext cx="189360" cy="675720"/>
+                            <a:ext cx="187920" cy="674280"/>
                           </a:xfrm>
                           <a:prstGeom prst="rect">
                             <a:avLst/>
@@ -5058,52 +5145,56 @@
                             <a:noFill/>
                           </a:ln>
                         </wps:spPr>
+                        <wps:style>
+                          <a:lnRef idx="0"/>
+                          <a:fillRef idx="0"/>
+                          <a:effectRef idx="0"/>
+                          <a:fontRef idx="minor"/>
+                        </wps:style>
                         <wps:txbx>
                           <w:txbxContent>
                             <w:p>
                               <w:pPr>
                                 <w:overflowPunct w:val="false"/>
                                 <w:spacing w:before="0" w:after="0" w:lineRule="auto" w:line="240"/>
-                                <w:ind w:left="0" w:right="0" w:hanging="0"/>
+                                <w:jc w:val="left"/>
                                 <w:rPr/>
                               </w:pPr>
                               <w:r>
                                 <w:rPr>
+                                  <w:smallCaps w:val="false"/>
+                                  <w:caps w:val="false"/>
+                                  <w:iCs w:val="false"/>
+                                  <w:bCs w:val="false"/>
+                                  <w:szCs w:val="36"/>
+                                  <w:spacing w:val="0"/>
+                                  <w:vertAlign w:val="baseline"/>
+                                  <w:position w:val="0"/>
                                   <w:sz w:val="36"/>
-                                  <w:b w:val="false"/>
-                                  <w:u w:val="none"/>
+                                  <w:i w:val="false"/>
                                   <w:dstrike w:val="false"/>
                                   <w:strike w:val="false"/>
-                                  <w:i w:val="false"/>
-                                  <w:outline w:val="false"/>
-                                  <w:shadow w:val="false"/>
-                                  <w:kern w:val="2"/>
-                                  <w:szCs w:val="36"/>
-                                  <w:bCs w:val="false"/>
-                                  <w:iCs w:val="false"/>
-                                  <w:em w:val="none"/>
-                                  <w:emboss w:val="false"/>
-                                  <w:imprint w:val="false"/>
-                                  <w:smallCaps w:val="false"/>
-                                  <w:caps w:val="false"/>
-                                  <w:rFonts w:asciiTheme="minorHAnsi" w:cstheme="minorBidi" w:eastAsiaTheme="minorEastAsia" w:hAnsiTheme="minorHAnsi" w:ascii="Liberation Sans" w:hAnsi="Liberation Sans" w:eastAsia="Noto Sans CJK SC" w:cs="FreeSans"/>
-                                  <w:color w:val="auto"/>
+                                  <w:u w:val="none"/>
+                                  <w:b w:val="false"/>
+                                  <w:sz w:val="36"/>
+                                  <w:rFonts w:asciiTheme="minorHAnsi" w:cstheme="minorBidi" w:eastAsiaTheme="minorEastAsia" w:hAnsiTheme="minorHAnsi" w:eastAsia="Noto Sans CJK SC" w:cs="FreeSans" w:ascii="Liberation Sans" w:hAnsi="Liberation Sans"/>
+                                  <w:color w:val="00000A"/>
                                 </w:rPr>
                                 <w:t>x</w:t>
                               </w:r>
                             </w:p>
                           </w:txbxContent>
                         </wps:txbx>
-                        <wps:bodyPr wrap="square" lIns="90000" rIns="90000" tIns="45000" bIns="45000" anchor="t">
+                        <wps:bodyPr lIns="90000" rIns="90000" tIns="279360" bIns="279360" anchor="t">
                           <a:noAutofit/>
                         </wps:bodyPr>
                       </wps:wsp>
                       <wps:wsp>
-                        <wps:cNvSpPr txBox="1"/>
+                        <wps:cNvSpPr/>
                         <wps:spPr>
                           <a:xfrm>
                             <a:off x="2656080" y="1669320"/>
-                            <a:ext cx="189720" cy="675720"/>
+                            <a:ext cx="188640" cy="674280"/>
                           </a:xfrm>
                           <a:prstGeom prst="rect">
                             <a:avLst/>
@@ -5113,43 +5204,47 @@
                             <a:noFill/>
                           </a:ln>
                         </wps:spPr>
+                        <wps:style>
+                          <a:lnRef idx="0"/>
+                          <a:fillRef idx="0"/>
+                          <a:effectRef idx="0"/>
+                          <a:fontRef idx="minor"/>
+                        </wps:style>
                         <wps:txbx>
                           <w:txbxContent>
                             <w:p>
                               <w:pPr>
                                 <w:overflowPunct w:val="false"/>
                                 <w:spacing w:before="0" w:after="0" w:lineRule="auto" w:line="240"/>
-                                <w:ind w:left="0" w:right="0" w:hanging="0"/>
+                                <w:jc w:val="left"/>
                                 <w:rPr/>
                               </w:pPr>
                               <w:r>
                                 <w:rPr>
+                                  <w:smallCaps w:val="false"/>
+                                  <w:caps w:val="false"/>
+                                  <w:iCs w:val="false"/>
+                                  <w:bCs w:val="false"/>
+                                  <w:szCs w:val="36"/>
+                                  <w:spacing w:val="0"/>
+                                  <w:vertAlign w:val="baseline"/>
+                                  <w:position w:val="0"/>
                                   <w:sz w:val="36"/>
-                                  <w:b w:val="false"/>
-                                  <w:u w:val="none"/>
+                                  <w:i w:val="false"/>
                                   <w:dstrike w:val="false"/>
                                   <w:strike w:val="false"/>
-                                  <w:i w:val="false"/>
-                                  <w:outline w:val="false"/>
-                                  <w:shadow w:val="false"/>
-                                  <w:kern w:val="2"/>
-                                  <w:szCs w:val="36"/>
-                                  <w:bCs w:val="false"/>
-                                  <w:iCs w:val="false"/>
-                                  <w:em w:val="none"/>
-                                  <w:emboss w:val="false"/>
-                                  <w:imprint w:val="false"/>
-                                  <w:smallCaps w:val="false"/>
-                                  <w:caps w:val="false"/>
-                                  <w:rFonts w:asciiTheme="minorHAnsi" w:cstheme="minorBidi" w:eastAsiaTheme="minorEastAsia" w:hAnsiTheme="minorHAnsi" w:ascii="Liberation Sans" w:hAnsi="Liberation Sans" w:eastAsia="Noto Sans CJK SC" w:cs="FreeSans"/>
-                                  <w:color w:val="auto"/>
+                                  <w:u w:val="none"/>
+                                  <w:b w:val="false"/>
+                                  <w:sz w:val="36"/>
+                                  <w:rFonts w:asciiTheme="minorHAnsi" w:cstheme="minorBidi" w:eastAsiaTheme="minorEastAsia" w:hAnsiTheme="minorHAnsi" w:eastAsia="Noto Sans CJK SC" w:cs="FreeSans" w:ascii="Liberation Sans" w:hAnsi="Liberation Sans"/>
+                                  <w:color w:val="00000A"/>
                                 </w:rPr>
                                 <w:t>z</w:t>
                               </w:r>
                             </w:p>
                           </w:txbxContent>
                         </wps:txbx>
-                        <wps:bodyPr wrap="square" lIns="90000" rIns="90000" tIns="45000" bIns="45000" anchor="t">
+                        <wps:bodyPr lIns="90000" rIns="90000" tIns="279360" bIns="279360" anchor="t">
                           <a:noAutofit/>
                         </wps:bodyPr>
                       </wps:wsp>
@@ -5158,7 +5253,7 @@
                         <wps:spPr>
                           <a:xfrm>
                             <a:off x="853560" y="1177920"/>
-                            <a:ext cx="0" cy="2259360"/>
+                            <a:ext cx="720" cy="2259360"/>
                           </a:xfrm>
                           <a:prstGeom prst="line">
                             <a:avLst/>
@@ -5183,11 +5278,11 @@
                         <wps:bodyPr/>
                       </wps:wsp>
                       <wps:wsp>
-                        <wps:cNvSpPr txBox="1"/>
+                        <wps:cNvSpPr/>
                         <wps:spPr>
                           <a:xfrm>
                             <a:off x="569520" y="2061720"/>
-                            <a:ext cx="283680" cy="676440"/>
+                            <a:ext cx="282600" cy="675000"/>
                           </a:xfrm>
                           <a:prstGeom prst="rect">
                             <a:avLst/>
@@ -5197,52 +5292,56 @@
                             <a:noFill/>
                           </a:ln>
                         </wps:spPr>
+                        <wps:style>
+                          <a:lnRef idx="0"/>
+                          <a:fillRef idx="0"/>
+                          <a:effectRef idx="0"/>
+                          <a:fontRef idx="minor"/>
+                        </wps:style>
                         <wps:txbx>
                           <w:txbxContent>
                             <w:p>
                               <w:pPr>
                                 <w:overflowPunct w:val="false"/>
                                 <w:spacing w:before="0" w:after="0" w:lineRule="auto" w:line="240"/>
-                                <w:ind w:left="0" w:right="0" w:hanging="0"/>
+                                <w:jc w:val="left"/>
                                 <w:rPr/>
                               </w:pPr>
                               <w:r>
                                 <w:rPr>
+                                  <w:smallCaps w:val="false"/>
+                                  <w:caps w:val="false"/>
+                                  <w:iCs w:val="false"/>
+                                  <w:bCs w:val="false"/>
+                                  <w:szCs w:val="36"/>
+                                  <w:spacing w:val="0"/>
+                                  <w:vertAlign w:val="baseline"/>
+                                  <w:position w:val="0"/>
                                   <w:sz w:val="36"/>
-                                  <w:b w:val="false"/>
-                                  <w:u w:val="none"/>
+                                  <w:i w:val="false"/>
                                   <w:dstrike w:val="false"/>
                                   <w:strike w:val="false"/>
-                                  <w:i w:val="false"/>
-                                  <w:outline w:val="false"/>
-                                  <w:shadow w:val="false"/>
-                                  <w:kern w:val="2"/>
-                                  <w:szCs w:val="36"/>
-                                  <w:bCs w:val="false"/>
-                                  <w:iCs w:val="false"/>
-                                  <w:em w:val="none"/>
-                                  <w:emboss w:val="false"/>
-                                  <w:imprint w:val="false"/>
-                                  <w:smallCaps w:val="false"/>
-                                  <w:caps w:val="false"/>
-                                  <w:rFonts w:asciiTheme="minorHAnsi" w:cstheme="minorBidi" w:eastAsiaTheme="minorEastAsia" w:hAnsiTheme="minorHAnsi" w:ascii="Liberation Sans" w:hAnsi="Liberation Sans" w:eastAsia="Noto Sans CJK SC" w:cs="FreeSans"/>
-                                  <w:color w:val="auto"/>
+                                  <w:u w:val="none"/>
+                                  <w:b w:val="false"/>
+                                  <w:sz w:val="36"/>
+                                  <w:rFonts w:asciiTheme="minorHAnsi" w:cstheme="minorBidi" w:eastAsiaTheme="minorEastAsia" w:hAnsiTheme="minorHAnsi" w:eastAsia="Noto Sans CJK SC" w:cs="FreeSans" w:ascii="Liberation Sans" w:hAnsi="Liberation Sans"/>
+                                  <w:color w:val="00000A"/>
                                 </w:rPr>
                                 <w:t>x</w:t>
                               </w:r>
                             </w:p>
                           </w:txbxContent>
                         </wps:txbx>
-                        <wps:bodyPr wrap="square" lIns="90000" rIns="90000" tIns="45000" bIns="45000" anchor="t">
+                        <wps:bodyPr lIns="90000" rIns="90000" tIns="279360" bIns="279360" anchor="t">
                           <a:noAutofit/>
                         </wps:bodyPr>
                       </wps:wsp>
                       <wps:wsp>
-                        <wps:cNvSpPr txBox="1"/>
+                        <wps:cNvSpPr/>
                         <wps:spPr>
                           <a:xfrm>
                             <a:off x="1517760" y="882720"/>
-                            <a:ext cx="189360" cy="676440"/>
+                            <a:ext cx="187920" cy="675000"/>
                           </a:xfrm>
                           <a:prstGeom prst="rect">
                             <a:avLst/>
@@ -5252,43 +5351,47 @@
                             <a:noFill/>
                           </a:ln>
                         </wps:spPr>
+                        <wps:style>
+                          <a:lnRef idx="0"/>
+                          <a:fillRef idx="0"/>
+                          <a:effectRef idx="0"/>
+                          <a:fontRef idx="minor"/>
+                        </wps:style>
                         <wps:txbx>
                           <w:txbxContent>
                             <w:p>
                               <w:pPr>
                                 <w:overflowPunct w:val="false"/>
                                 <w:spacing w:before="0" w:after="0" w:lineRule="auto" w:line="240"/>
-                                <w:ind w:left="0" w:right="0" w:hanging="0"/>
+                                <w:jc w:val="left"/>
                                 <w:rPr/>
                               </w:pPr>
                               <w:r>
                                 <w:rPr>
+                                  <w:smallCaps w:val="false"/>
+                                  <w:caps w:val="false"/>
+                                  <w:iCs w:val="false"/>
+                                  <w:bCs w:val="false"/>
+                                  <w:szCs w:val="36"/>
+                                  <w:spacing w:val="0"/>
+                                  <w:vertAlign w:val="baseline"/>
+                                  <w:position w:val="0"/>
                                   <w:sz w:val="36"/>
-                                  <w:b w:val="false"/>
-                                  <w:u w:val="none"/>
+                                  <w:i w:val="false"/>
                                   <w:dstrike w:val="false"/>
                                   <w:strike w:val="false"/>
-                                  <w:i w:val="false"/>
-                                  <w:outline w:val="false"/>
-                                  <w:shadow w:val="false"/>
-                                  <w:kern w:val="2"/>
-                                  <w:szCs w:val="36"/>
-                                  <w:bCs w:val="false"/>
-                                  <w:iCs w:val="false"/>
-                                  <w:em w:val="none"/>
-                                  <w:emboss w:val="false"/>
-                                  <w:imprint w:val="false"/>
-                                  <w:smallCaps w:val="false"/>
-                                  <w:caps w:val="false"/>
-                                  <w:rFonts w:asciiTheme="minorHAnsi" w:cstheme="minorBidi" w:eastAsiaTheme="minorEastAsia" w:hAnsiTheme="minorHAnsi" w:ascii="Liberation Sans" w:hAnsi="Liberation Sans" w:eastAsia="Noto Sans CJK SC" w:cs="FreeSans"/>
-                                  <w:color w:val="auto"/>
+                                  <w:u w:val="none"/>
+                                  <w:b w:val="false"/>
+                                  <w:sz w:val="36"/>
+                                  <w:rFonts w:asciiTheme="minorHAnsi" w:cstheme="minorBidi" w:eastAsiaTheme="minorEastAsia" w:hAnsiTheme="minorHAnsi" w:eastAsia="Noto Sans CJK SC" w:cs="FreeSans" w:ascii="Liberation Sans" w:hAnsi="Liberation Sans"/>
+                                  <w:color w:val="00000A"/>
                                 </w:rPr>
                                 <w:t>z</w:t>
                               </w:r>
                             </w:p>
                           </w:txbxContent>
                         </wps:txbx>
-                        <wps:bodyPr wrap="square" lIns="90000" rIns="90000" tIns="45000" bIns="45000" anchor="t">
+                        <wps:bodyPr lIns="90000" rIns="90000" tIns="279360" bIns="279360" anchor="t">
                           <a:noAutofit/>
                         </wps:bodyPr>
                       </wps:wsp>
@@ -5306,17 +5409,17 @@
                   <v:fill o:detectmouseclick="t" on="false"/>
                   <w10:wrap type="none"/>
                 </v:line>
-                <v:oval id="shape_0" fillcolor="#729fcf" stroked="t" o:allowincell="f" style="position:absolute;left:4508;top:5506;width:596;height:617;mso-wrap-style:none;v-text-anchor:middle">
+                <v:oval id="shape_0" path="l-2147483648,-2147483643l-2147483628,-2147483627l-2147483648,-2147483643l-2147483626,-2147483625xe" fillcolor="#729fcf" stroked="t" o:allowincell="f" style="position:absolute;left:4508;top:5506;width:594;height:615;mso-wrap-style:none;v-text-anchor:middle">
                   <v:fill o:detectmouseclick="t" type="solid" color2="#8d6030"/>
                   <v:stroke color="black" joinstyle="round" endcap="flat"/>
                   <w10:wrap type="none"/>
                 </v:oval>
-                <v:rect id="shape_0" fillcolor="black" stroked="t" o:allowincell="f" style="position:absolute;left:2268;top:1485;width:745;height:618;mso-wrap-style:none;v-text-anchor:middle">
+                <v:rect id="shape_0" path="m0,0l-2147483645,0l-2147483645,-2147483646l0,-2147483646xe" fillcolor="black" stroked="t" o:allowincell="f" style="position:absolute;left:2268;top:1485;width:743;height:616;mso-wrap-style:none;v-text-anchor:middle">
                   <v:fill o:detectmouseclick="t" type="solid" color2="white"/>
                   <v:stroke color="white" joinstyle="round" endcap="flat"/>
                   <w10:wrap type="none"/>
                 </v:rect>
-                <v:rect id="shape_0" fillcolor="white" stroked="t" o:allowincell="f" style="position:absolute;left:6300;top:2723;width:747;height:617;mso-wrap-style:none;v-text-anchor:middle">
+                <v:rect id="shape_0" path="m0,0l-2147483645,0l-2147483645,-2147483646l0,-2147483646xe" fillcolor="white" stroked="t" o:allowincell="f" style="position:absolute;left:6300;top:2723;width:745;height:615;mso-wrap-style:none;v-text-anchor:middle">
                   <v:fill o:detectmouseclick="t" type="solid" color2="black"/>
                   <v:stroke color="black" joinstyle="round" endcap="flat"/>
                   <w10:wrap type="none"/>
@@ -5336,16 +5439,6 @@
                   <v:fill o:detectmouseclick="t" on="false"/>
                   <w10:wrap type="none"/>
                 </v:line>
-                <v:shape id="shape_0" coordsize="802,674" path="m15,673c0,277,502,0,801,265e" stroked="t" o:allowincell="f" style="position:absolute;left:4407;top:4773;width:445;height:289">
-                  <v:stroke color="#3465a4" joinstyle="round" endcap="flat"/>
-                  <v:fill o:detectmouseclick="t" on="false"/>
-                  <w10:wrap type="none"/>
-                </v:shape>
-                <v:shape id="shape_0" coordsize="951,599" path="m0,224c316,155,876,0,950,530l950,598e" stroked="t" o:allowincell="f" style="position:absolute;left:4815;top:4962;width:538;height:254">
-                  <v:stroke color="#3465a4" joinstyle="round" endcap="flat"/>
-                  <v:fill o:detectmouseclick="t" on="false"/>
-                  <w10:wrap type="none"/>
-                </v:shape>
                 <v:line id="shape_0" from="2715,1794" to="4806,1794" stroked="t" o:allowincell="f" style="position:absolute">
                   <v:stroke color="#3465a4" dashstyle="shortdot" joinstyle="round" endcap="round"/>
                   <v:fill o:detectmouseclick="t" on="false"/>
@@ -5356,41 +5449,35 @@
                   <v:fill o:detectmouseclick="t" on="false"/>
                   <w10:wrap type="none"/>
                 </v:line>
-                <v:shapetype id="_x0000_t202" coordsize="21600,21600" o:spt="202" path="m,l,21600l21600,21600l21600,xe">
-                  <v:stroke joinstyle="miter"/>
-                  <v:path gradientshapeok="t" o:connecttype="rect"/>
-                </v:shapetype>
-                <v:shape id="shape_0" stroked="f" o:allowincell="f" style="position:absolute;left:4359;top:4423;width:148;height:1063;mso-wrap-style:square;v-text-anchor:top" type="_x0000_t202">
+                <v:rect id="shape_0" path="m0,0l-2147483645,0l-2147483645,-2147483646l0,-2147483646xe" stroked="f" o:allowincell="f" style="position:absolute;left:4359;top:4423;width:146;height:1061;mso-wrap-style:square;v-text-anchor:top">
                   <v:textbox>
                     <w:txbxContent>
                       <w:p>
                         <w:pPr>
                           <w:overflowPunct w:val="false"/>
                           <w:spacing w:before="0" w:after="0" w:lineRule="auto" w:line="240"/>
-                          <w:ind w:left="0" w:right="0" w:hanging="0"/>
+                          <w:jc w:val="left"/>
                           <w:rPr/>
                         </w:pPr>
                         <w:r>
                           <w:rPr>
+                            <w:smallCaps w:val="false"/>
+                            <w:caps w:val="false"/>
+                            <w:iCs w:val="false"/>
+                            <w:bCs w:val="false"/>
+                            <w:szCs w:val="36"/>
+                            <w:spacing w:val="0"/>
+                            <w:vertAlign w:val="baseline"/>
+                            <w:position w:val="0"/>
                             <w:sz w:val="36"/>
-                            <w:b w:val="false"/>
-                            <w:u w:val="none"/>
+                            <w:i w:val="false"/>
                             <w:dstrike w:val="false"/>
                             <w:strike w:val="false"/>
-                            <w:i w:val="false"/>
-                            <w:outline w:val="false"/>
-                            <w:shadow w:val="false"/>
-                            <w:kern w:val="2"/>
-                            <w:szCs w:val="36"/>
-                            <w:bCs w:val="false"/>
-                            <w:iCs w:val="false"/>
-                            <w:em w:val="none"/>
-                            <w:emboss w:val="false"/>
-                            <w:imprint w:val="false"/>
-                            <w:smallCaps w:val="false"/>
-                            <w:caps w:val="false"/>
-                            <w:rFonts w:asciiTheme="minorHAnsi" w:cstheme="minorBidi" w:eastAsiaTheme="minorEastAsia" w:hAnsiTheme="minorHAnsi" w:ascii="Liberation Sans" w:hAnsi="Liberation Sans" w:eastAsia="Noto Sans CJK SC" w:cs="FreeSans"/>
-                            <w:color w:val="auto"/>
+                            <w:u w:val="none"/>
+                            <w:b w:val="false"/>
+                            <w:sz w:val="36"/>
+                            <w:rFonts w:asciiTheme="minorHAnsi" w:cstheme="minorBidi" w:eastAsiaTheme="minorEastAsia" w:hAnsiTheme="minorHAnsi" w:eastAsia="Noto Sans CJK SC" w:cs="FreeSans" w:ascii="Liberation Sans" w:hAnsi="Liberation Sans"/>
+                            <w:color w:val="00000A"/>
                           </w:rPr>
                           <w:t>ω</w:t>
                         </w:r>
@@ -5398,40 +5485,38 @@
                     </w:txbxContent>
                   </v:textbox>
                   <v:fill o:detectmouseclick="t" on="false"/>
-                  <v:stroke color="black" joinstyle="round" endcap="flat"/>
+                  <v:stroke color="#3465a4" joinstyle="round" endcap="flat"/>
                   <w10:wrap type="none"/>
-                </v:shape>
-                <v:shape id="shape_0" stroked="f" o:allowincell="f" style="position:absolute;left:4956;top:4423;width:297;height:1063;mso-wrap-style:square;v-text-anchor:top" type="_x0000_t202">
+                </v:rect>
+                <v:rect id="shape_0" path="m0,0l-2147483645,0l-2147483645,-2147483646l0,-2147483646xe" stroked="f" o:allowincell="f" style="position:absolute;left:4956;top:4423;width:295;height:1061;mso-wrap-style:square;v-text-anchor:top">
                   <v:textbox>
                     <w:txbxContent>
                       <w:p>
                         <w:pPr>
                           <w:overflowPunct w:val="false"/>
                           <w:spacing w:before="0" w:after="0" w:lineRule="auto" w:line="240"/>
-                          <w:ind w:left="0" w:right="0" w:hanging="0"/>
+                          <w:jc w:val="left"/>
                           <w:rPr/>
                         </w:pPr>
                         <w:r>
                           <w:rPr>
+                            <w:smallCaps w:val="false"/>
+                            <w:caps w:val="false"/>
+                            <w:iCs w:val="false"/>
+                            <w:bCs w:val="false"/>
+                            <w:szCs w:val="36"/>
+                            <w:spacing w:val="0"/>
+                            <w:vertAlign w:val="baseline"/>
+                            <w:position w:val="0"/>
                             <w:sz w:val="36"/>
-                            <w:b w:val="false"/>
-                            <w:u w:val="none"/>
+                            <w:i w:val="false"/>
                             <w:dstrike w:val="false"/>
                             <w:strike w:val="false"/>
-                            <w:i w:val="false"/>
-                            <w:outline w:val="false"/>
-                            <w:shadow w:val="false"/>
-                            <w:kern w:val="2"/>
-                            <w:szCs w:val="36"/>
-                            <w:bCs w:val="false"/>
-                            <w:iCs w:val="false"/>
-                            <w:em w:val="none"/>
-                            <w:emboss w:val="false"/>
-                            <w:imprint w:val="false"/>
-                            <w:smallCaps w:val="false"/>
-                            <w:caps w:val="false"/>
-                            <w:rFonts w:asciiTheme="minorHAnsi" w:cstheme="minorBidi" w:eastAsiaTheme="minorEastAsia" w:hAnsiTheme="minorHAnsi" w:ascii="Liberation Sans" w:hAnsi="Liberation Sans" w:eastAsia="Noto Sans CJK SC" w:cs="FreeSans"/>
-                            <w:color w:val="auto"/>
+                            <w:u w:val="none"/>
+                            <w:b w:val="false"/>
+                            <w:sz w:val="36"/>
+                            <w:rFonts w:asciiTheme="minorHAnsi" w:cstheme="minorBidi" w:eastAsiaTheme="minorEastAsia" w:hAnsiTheme="minorHAnsi" w:eastAsia="Noto Sans CJK SC" w:cs="FreeSans" w:ascii="Liberation Sans" w:hAnsi="Liberation Sans"/>
+                            <w:color w:val="00000A"/>
                           </w:rPr>
                           <w:t>ω</w:t>
                         </w:r>
@@ -5439,40 +5524,38 @@
                     </w:txbxContent>
                   </v:textbox>
                   <v:fill o:detectmouseclick="t" on="false"/>
-                  <v:stroke color="black" joinstyle="round" endcap="flat"/>
+                  <v:stroke color="#3465a4" joinstyle="round" endcap="flat"/>
                   <w10:wrap type="none"/>
-                </v:shape>
-                <v:shape id="shape_0" stroked="f" o:allowincell="f" style="position:absolute;left:4956;top:3806;width:297;height:1063;mso-wrap-style:square;v-text-anchor:top" type="_x0000_t202">
+                </v:rect>
+                <v:rect id="shape_0" path="m0,0l-2147483645,0l-2147483645,-2147483646l0,-2147483646xe" stroked="f" o:allowincell="f" style="position:absolute;left:4956;top:3806;width:295;height:1061;mso-wrap-style:square;v-text-anchor:top">
                   <v:textbox>
                     <w:txbxContent>
                       <w:p>
                         <w:pPr>
                           <w:overflowPunct w:val="false"/>
                           <w:spacing w:before="0" w:after="0" w:lineRule="auto" w:line="240"/>
-                          <w:ind w:left="0" w:right="0" w:hanging="0"/>
+                          <w:jc w:val="left"/>
                           <w:rPr/>
                         </w:pPr>
                         <w:r>
                           <w:rPr>
+                            <w:smallCaps w:val="false"/>
+                            <w:caps w:val="false"/>
+                            <w:iCs w:val="false"/>
+                            <w:bCs w:val="false"/>
+                            <w:szCs w:val="36"/>
+                            <w:spacing w:val="0"/>
+                            <w:vertAlign w:val="baseline"/>
+                            <w:position w:val="0"/>
                             <w:sz w:val="36"/>
-                            <w:b w:val="false"/>
-                            <w:u w:val="none"/>
+                            <w:i w:val="false"/>
                             <w:dstrike w:val="false"/>
                             <w:strike w:val="false"/>
-                            <w:i w:val="false"/>
-                            <w:outline w:val="false"/>
-                            <w:shadow w:val="false"/>
-                            <w:kern w:val="2"/>
-                            <w:szCs w:val="36"/>
-                            <w:bCs w:val="false"/>
-                            <w:iCs w:val="false"/>
-                            <w:em w:val="none"/>
-                            <w:emboss w:val="false"/>
-                            <w:imprint w:val="false"/>
-                            <w:smallCaps w:val="false"/>
-                            <w:caps w:val="false"/>
-                            <w:rFonts w:asciiTheme="minorHAnsi" w:cstheme="minorBidi" w:eastAsiaTheme="minorEastAsia" w:hAnsiTheme="minorHAnsi" w:ascii="Liberation Sans" w:hAnsi="Liberation Sans" w:eastAsia="Noto Sans CJK SC" w:cs="FreeSans"/>
-                            <w:color w:val="auto"/>
+                            <w:u w:val="none"/>
+                            <w:b w:val="false"/>
+                            <w:sz w:val="36"/>
+                            <w:rFonts w:asciiTheme="minorHAnsi" w:cstheme="minorBidi" w:eastAsiaTheme="minorEastAsia" w:hAnsiTheme="minorHAnsi" w:eastAsia="Noto Sans CJK SC" w:cs="FreeSans" w:ascii="Liberation Sans" w:hAnsi="Liberation Sans"/>
+                            <w:color w:val="00000A"/>
                           </w:rPr>
                           <w:t>x</w:t>
                         </w:r>
@@ -5480,40 +5563,38 @@
                     </w:txbxContent>
                   </v:textbox>
                   <v:fill o:detectmouseclick="t" on="false"/>
-                  <v:stroke color="black" joinstyle="round" endcap="flat"/>
+                  <v:stroke color="#3465a4" joinstyle="round" endcap="flat"/>
                   <w10:wrap type="none"/>
-                </v:shape>
-                <v:shape id="shape_0" stroked="f" o:allowincell="f" style="position:absolute;left:5554;top:2568;width:298;height:1063;mso-wrap-style:square;v-text-anchor:top" type="_x0000_t202">
+                </v:rect>
+                <v:rect id="shape_0" path="m0,0l-2147483645,0l-2147483645,-2147483646l0,-2147483646xe" stroked="f" o:allowincell="f" style="position:absolute;left:5554;top:2568;width:296;height:1061;mso-wrap-style:square;v-text-anchor:top">
                   <v:textbox>
                     <w:txbxContent>
                       <w:p>
                         <w:pPr>
                           <w:overflowPunct w:val="false"/>
                           <w:spacing w:before="0" w:after="0" w:lineRule="auto" w:line="240"/>
-                          <w:ind w:left="0" w:right="0" w:hanging="0"/>
+                          <w:jc w:val="left"/>
                           <w:rPr/>
                         </w:pPr>
                         <w:r>
                           <w:rPr>
+                            <w:smallCaps w:val="false"/>
+                            <w:caps w:val="false"/>
+                            <w:iCs w:val="false"/>
+                            <w:bCs w:val="false"/>
+                            <w:szCs w:val="36"/>
+                            <w:spacing w:val="0"/>
+                            <w:vertAlign w:val="baseline"/>
+                            <w:position w:val="0"/>
                             <w:sz w:val="36"/>
-                            <w:b w:val="false"/>
-                            <w:u w:val="none"/>
+                            <w:i w:val="false"/>
                             <w:dstrike w:val="false"/>
                             <w:strike w:val="false"/>
-                            <w:i w:val="false"/>
-                            <w:outline w:val="false"/>
-                            <w:shadow w:val="false"/>
-                            <w:kern w:val="2"/>
-                            <w:szCs w:val="36"/>
-                            <w:bCs w:val="false"/>
-                            <w:iCs w:val="false"/>
-                            <w:em w:val="none"/>
-                            <w:emboss w:val="false"/>
-                            <w:imprint w:val="false"/>
-                            <w:smallCaps w:val="false"/>
-                            <w:caps w:val="false"/>
-                            <w:rFonts w:asciiTheme="minorHAnsi" w:cstheme="minorBidi" w:eastAsiaTheme="minorEastAsia" w:hAnsiTheme="minorHAnsi" w:ascii="Liberation Sans" w:hAnsi="Liberation Sans" w:eastAsia="Noto Sans CJK SC" w:cs="FreeSans"/>
-                            <w:color w:val="auto"/>
+                            <w:u w:val="none"/>
+                            <w:b w:val="false"/>
+                            <w:sz w:val="36"/>
+                            <w:rFonts w:asciiTheme="minorHAnsi" w:cstheme="minorBidi" w:eastAsiaTheme="minorEastAsia" w:hAnsiTheme="minorHAnsi" w:eastAsia="Noto Sans CJK SC" w:cs="FreeSans" w:ascii="Liberation Sans" w:hAnsi="Liberation Sans"/>
+                            <w:color w:val="00000A"/>
                           </w:rPr>
                           <w:t>z</w:t>
                         </w:r>
@@ -5521,45 +5602,43 @@
                     </w:txbxContent>
                   </v:textbox>
                   <v:fill o:detectmouseclick="t" on="false"/>
-                  <v:stroke color="black" joinstyle="round" endcap="flat"/>
+                  <v:stroke color="#3465a4" joinstyle="round" endcap="flat"/>
                   <w10:wrap type="none"/>
-                </v:shape>
+                </v:rect>
                 <v:line id="shape_0" from="2715,1794" to="2715,5351" stroked="t" o:allowincell="f" style="position:absolute">
                   <v:stroke color="#3465a4" dashstyle="longdash" startarrow="block" endarrow="block" startarrowwidth="medium" startarrowlength="medium" endarrowwidth="medium" endarrowlength="medium" joinstyle="round" endcap="round"/>
                   <v:fill o:detectmouseclick="t" on="false"/>
                   <w10:wrap type="none"/>
                 </v:line>
-                <v:shape id="shape_0" stroked="f" o:allowincell="f" style="position:absolute;left:2268;top:3186;width:446;height:1064;mso-wrap-style:square;v-text-anchor:top" type="_x0000_t202">
+                <v:rect id="shape_0" path="m0,0l-2147483645,0l-2147483645,-2147483646l0,-2147483646xe" stroked="f" o:allowincell="f" style="position:absolute;left:2268;top:3186;width:444;height:1062;mso-wrap-style:square;v-text-anchor:top">
                   <v:textbox>
                     <w:txbxContent>
                       <w:p>
                         <w:pPr>
                           <w:overflowPunct w:val="false"/>
                           <w:spacing w:before="0" w:after="0" w:lineRule="auto" w:line="240"/>
-                          <w:ind w:left="0" w:right="0" w:hanging="0"/>
+                          <w:jc w:val="left"/>
                           <w:rPr/>
                         </w:pPr>
                         <w:r>
                           <w:rPr>
+                            <w:smallCaps w:val="false"/>
+                            <w:caps w:val="false"/>
+                            <w:iCs w:val="false"/>
+                            <w:bCs w:val="false"/>
+                            <w:szCs w:val="36"/>
+                            <w:spacing w:val="0"/>
+                            <w:vertAlign w:val="baseline"/>
+                            <w:position w:val="0"/>
                             <w:sz w:val="36"/>
-                            <w:b w:val="false"/>
-                            <w:u w:val="none"/>
+                            <w:i w:val="false"/>
                             <w:dstrike w:val="false"/>
                             <w:strike w:val="false"/>
-                            <w:i w:val="false"/>
-                            <w:outline w:val="false"/>
-                            <w:shadow w:val="false"/>
-                            <w:kern w:val="2"/>
-                            <w:szCs w:val="36"/>
-                            <w:bCs w:val="false"/>
-                            <w:iCs w:val="false"/>
-                            <w:em w:val="none"/>
-                            <w:emboss w:val="false"/>
-                            <w:imprint w:val="false"/>
-                            <w:smallCaps w:val="false"/>
-                            <w:caps w:val="false"/>
-                            <w:rFonts w:asciiTheme="minorHAnsi" w:cstheme="minorBidi" w:eastAsiaTheme="minorEastAsia" w:hAnsiTheme="minorHAnsi" w:ascii="Liberation Sans" w:hAnsi="Liberation Sans" w:eastAsia="Noto Sans CJK SC" w:cs="FreeSans"/>
-                            <w:color w:val="auto"/>
+                            <w:u w:val="none"/>
+                            <w:b w:val="false"/>
+                            <w:sz w:val="36"/>
+                            <w:rFonts w:asciiTheme="minorHAnsi" w:cstheme="minorBidi" w:eastAsiaTheme="minorEastAsia" w:hAnsiTheme="minorHAnsi" w:eastAsia="Noto Sans CJK SC" w:cs="FreeSans" w:ascii="Liberation Sans" w:hAnsi="Liberation Sans"/>
+                            <w:color w:val="00000A"/>
                           </w:rPr>
                           <w:t>x</w:t>
                         </w:r>
@@ -5567,40 +5646,38 @@
                     </w:txbxContent>
                   </v:textbox>
                   <v:fill o:detectmouseclick="t" on="false"/>
-                  <v:stroke color="black" joinstyle="round" endcap="flat"/>
+                  <v:stroke color="#3465a4" joinstyle="round" endcap="flat"/>
                   <w10:wrap type="none"/>
-                </v:shape>
-                <v:shape id="shape_0" stroked="f" o:allowincell="f" style="position:absolute;left:3761;top:1329;width:297;height:1064;mso-wrap-style:square;v-text-anchor:top" type="_x0000_t202">
+                </v:rect>
+                <v:rect id="shape_0" path="m0,0l-2147483645,0l-2147483645,-2147483646l0,-2147483646xe" stroked="f" o:allowincell="f" style="position:absolute;left:3761;top:1329;width:295;height:1062;mso-wrap-style:square;v-text-anchor:top">
                   <v:textbox>
                     <w:txbxContent>
                       <w:p>
                         <w:pPr>
                           <w:overflowPunct w:val="false"/>
                           <w:spacing w:before="0" w:after="0" w:lineRule="auto" w:line="240"/>
-                          <w:ind w:left="0" w:right="0" w:hanging="0"/>
+                          <w:jc w:val="left"/>
                           <w:rPr/>
                         </w:pPr>
                         <w:r>
                           <w:rPr>
+                            <w:smallCaps w:val="false"/>
+                            <w:caps w:val="false"/>
+                            <w:iCs w:val="false"/>
+                            <w:bCs w:val="false"/>
+                            <w:szCs w:val="36"/>
+                            <w:spacing w:val="0"/>
+                            <w:vertAlign w:val="baseline"/>
+                            <w:position w:val="0"/>
                             <w:sz w:val="36"/>
-                            <w:b w:val="false"/>
-                            <w:u w:val="none"/>
+                            <w:i w:val="false"/>
                             <w:dstrike w:val="false"/>
                             <w:strike w:val="false"/>
-                            <w:i w:val="false"/>
-                            <w:outline w:val="false"/>
-                            <w:shadow w:val="false"/>
-                            <w:kern w:val="2"/>
-                            <w:szCs w:val="36"/>
-                            <w:bCs w:val="false"/>
-                            <w:iCs w:val="false"/>
-                            <w:em w:val="none"/>
-                            <w:emboss w:val="false"/>
-                            <w:imprint w:val="false"/>
-                            <w:smallCaps w:val="false"/>
-                            <w:caps w:val="false"/>
-                            <w:rFonts w:asciiTheme="minorHAnsi" w:cstheme="minorBidi" w:eastAsiaTheme="minorEastAsia" w:hAnsiTheme="minorHAnsi" w:ascii="Liberation Sans" w:hAnsi="Liberation Sans" w:eastAsia="Noto Sans CJK SC" w:cs="FreeSans"/>
-                            <w:color w:val="auto"/>
+                            <w:u w:val="none"/>
+                            <w:b w:val="false"/>
+                            <w:sz w:val="36"/>
+                            <w:rFonts w:asciiTheme="minorHAnsi" w:cstheme="minorBidi" w:eastAsiaTheme="minorEastAsia" w:hAnsiTheme="minorHAnsi" w:eastAsia="Noto Sans CJK SC" w:cs="FreeSans" w:ascii="Liberation Sans" w:hAnsi="Liberation Sans"/>
+                            <w:color w:val="00000A"/>
                           </w:rPr>
                           <w:t>z</w:t>
                         </w:r>
@@ -5608,9 +5685,9 @@
                     </w:txbxContent>
                   </v:textbox>
                   <v:fill o:detectmouseclick="t" on="false"/>
-                  <v:stroke color="black" joinstyle="round" endcap="flat"/>
+                  <v:stroke color="#3465a4" joinstyle="round" endcap="flat"/>
                   <w10:wrap type="none"/>
-                </v:shape>
+                </v:rect>
               </v:group>
             </w:pict>
           </mc:Fallback>
@@ -5633,7 +5710,7 @@
                 <a:graphic xmlns:a="http://schemas.openxmlformats.org/drawingml/2006/main">
                   <a:graphicData uri="http://schemas.microsoft.com/office/word/2010/wordprocessingShape">
                     <wps:wsp>
-                      <wps:cNvSpPr txBox="1"/>
+                      <wps:cNvSpPr/>
                       <wps:spPr>
                         <a:xfrm>
                           <a:off x="0" y="0"/>
@@ -5647,43 +5724,55 @@
                           <a:noFill/>
                         </a:ln>
                       </wps:spPr>
+                      <wps:style>
+                        <a:lnRef idx="0"/>
+                        <a:fillRef idx="0"/>
+                        <a:effectRef idx="0"/>
+                        <a:fontRef idx="minor"/>
+                      </wps:style>
                       <wps:txbx>
                         <w:txbxContent>
                           <w:p>
                             <w:pPr>
+                              <w:pStyle w:val="FrameContents"/>
                               <w:overflowPunct w:val="false"/>
-                              <w:spacing w:before="0" w:after="0" w:lineRule="auto" w:line="240"/>
-                              <w:rPr/>
+                              <w:spacing w:lineRule="auto" w:line="240" w:before="0" w:after="0"/>
+                              <w:rPr>
+                                <w:color w:val="000000"/>
+                              </w:rPr>
                             </w:pPr>
                             <w:r>
                               <w:rPr>
+                                <w:rFonts w:eastAsia="ＭＳ 明朝" w:cs="" w:ascii="Cambria" w:hAnsi="Cambria" w:asciiTheme="minorHAnsi" w:cstheme="minorBidi" w:eastAsiaTheme="minorEastAsia" w:hAnsiTheme="minorHAnsi"/>
+                                <w:color w:val="000000"/>
                                 <w:sz w:val="22"/>
-                                <w:rFonts w:ascii="Cambria" w:hAnsi="Cambria" w:eastAsia="ＭＳ 明朝" w:asciiTheme="minorHAnsi" w:cstheme="minorBidi" w:eastAsiaTheme="minorEastAsia" w:hAnsiTheme="minorHAnsi"/>
                               </w:rPr>
                               <w:t>1</w:t>
                             </w:r>
                             <w:r>
                               <w:rPr>
+                                <w:rFonts w:eastAsia="ＭＳ 明朝" w:cs="" w:ascii="Cambria" w:hAnsi="Cambria" w:asciiTheme="minorHAnsi" w:cstheme="minorBidi" w:eastAsiaTheme="minorEastAsia" w:hAnsiTheme="minorHAnsi"/>
+                                <w:color w:val="000000"/>
                                 <w:sz w:val="22"/>
                                 <w:vertAlign w:val="superscript"/>
-                                <w:rFonts w:ascii="Cambria" w:hAnsi="Cambria" w:eastAsia="ＭＳ 明朝" w:asciiTheme="minorHAnsi" w:cstheme="minorBidi" w:eastAsiaTheme="minorEastAsia" w:hAnsiTheme="minorHAnsi"/>
                               </w:rPr>
                               <w:t>ο</w:t>
                             </w:r>
                             <w:r>
                               <w:rPr>
+                                <w:rFonts w:eastAsia="ＭＳ 明朝" w:cs="" w:ascii="Cambria" w:hAnsi="Cambria" w:asciiTheme="minorHAnsi" w:cstheme="minorBidi" w:eastAsiaTheme="minorEastAsia" w:hAnsiTheme="minorHAnsi"/>
+                                <w:color w:val="000000"/>
+                                <w:position w:val="0"/>
+                                <w:sz w:val="22"/>
                                 <w:sz w:val="22"/>
                                 <w:vertAlign w:val="baseline"/>
-                                <w:position w:val="0"/>
-                                <w:sz w:val="22"/>
-                                <w:rFonts w:ascii="Cambria" w:hAnsi="Cambria" w:eastAsia="ＭＳ 明朝" w:asciiTheme="minorHAnsi" w:cstheme="minorBidi" w:eastAsiaTheme="minorEastAsia" w:hAnsiTheme="minorHAnsi"/>
                               </w:rPr>
                               <w:t xml:space="preserve"> τετ.</w:t>
                             </w:r>
                           </w:p>
                         </w:txbxContent>
                       </wps:txbx>
-                      <wps:bodyPr wrap="square" lIns="0" rIns="0" tIns="0" bIns="0" anchor="t">
+                      <wps:bodyPr lIns="0" rIns="0" tIns="0" bIns="0" anchor="t">
                         <a:noAutofit/>
                       </wps:bodyPr>
                     </wps:wsp>
@@ -5694,54 +5783,60 @@
           </mc:Choice>
           <mc:Fallback>
             <w:pict>
-              <v:shape id="shape_0" ID="Text Frame 1" stroked="f" o:allowincell="f" style="position:absolute;margin-left:340.8pt;margin-top:52pt;width:27.7pt;height:25.6pt;mso-wrap-style:square;v-text-anchor:top" type="_x0000_t202">
+              <v:rect id="shape_0" ID="Text Frame 1" path="m0,0l-2147483645,0l-2147483645,-2147483646l0,-2147483646xe" stroked="f" o:allowincell="f" style="position:absolute;margin-left:340.8pt;margin-top:52pt;width:27.7pt;height:25.6pt;mso-wrap-style:square;v-text-anchor:top">
+                <v:fill o:detectmouseclick="t" on="false"/>
+                <v:stroke color="#3465a4" joinstyle="round" endcap="flat"/>
                 <v:textbox>
                   <w:txbxContent>
                     <w:p>
                       <w:pPr>
+                        <w:pStyle w:val="FrameContents"/>
                         <w:overflowPunct w:val="false"/>
-                        <w:spacing w:before="0" w:after="0" w:lineRule="auto" w:line="240"/>
-                        <w:rPr/>
+                        <w:spacing w:lineRule="auto" w:line="240" w:before="0" w:after="0"/>
+                        <w:rPr>
+                          <w:color w:val="000000"/>
+                        </w:rPr>
                       </w:pPr>
                       <w:r>
                         <w:rPr>
+                          <w:rFonts w:eastAsia="ＭＳ 明朝" w:cs="" w:ascii="Cambria" w:hAnsi="Cambria" w:asciiTheme="minorHAnsi" w:cstheme="minorBidi" w:eastAsiaTheme="minorEastAsia" w:hAnsiTheme="minorHAnsi"/>
+                          <w:color w:val="000000"/>
                           <w:sz w:val="22"/>
-                          <w:rFonts w:ascii="Cambria" w:hAnsi="Cambria" w:eastAsia="ＭＳ 明朝" w:asciiTheme="minorHAnsi" w:cstheme="minorBidi" w:eastAsiaTheme="minorEastAsia" w:hAnsiTheme="minorHAnsi"/>
                         </w:rPr>
                         <w:t>1</w:t>
                       </w:r>
                       <w:r>
                         <w:rPr>
+                          <w:rFonts w:eastAsia="ＭＳ 明朝" w:cs="" w:ascii="Cambria" w:hAnsi="Cambria" w:asciiTheme="minorHAnsi" w:cstheme="minorBidi" w:eastAsiaTheme="minorEastAsia" w:hAnsiTheme="minorHAnsi"/>
+                          <w:color w:val="000000"/>
                           <w:sz w:val="22"/>
                           <w:vertAlign w:val="superscript"/>
-                          <w:rFonts w:ascii="Cambria" w:hAnsi="Cambria" w:eastAsia="ＭＳ 明朝" w:asciiTheme="minorHAnsi" w:cstheme="minorBidi" w:eastAsiaTheme="minorEastAsia" w:hAnsiTheme="minorHAnsi"/>
                         </w:rPr>
                         <w:t>ο</w:t>
                       </w:r>
                       <w:r>
                         <w:rPr>
+                          <w:rFonts w:eastAsia="ＭＳ 明朝" w:cs="" w:ascii="Cambria" w:hAnsi="Cambria" w:asciiTheme="minorHAnsi" w:cstheme="minorBidi" w:eastAsiaTheme="minorEastAsia" w:hAnsiTheme="minorHAnsi"/>
+                          <w:color w:val="000000"/>
+                          <w:position w:val="0"/>
+                          <w:sz w:val="22"/>
                           <w:sz w:val="22"/>
                           <w:vertAlign w:val="baseline"/>
-                          <w:position w:val="0"/>
-                          <w:sz w:val="22"/>
-                          <w:rFonts w:ascii="Cambria" w:hAnsi="Cambria" w:eastAsia="ＭＳ 明朝" w:asciiTheme="minorHAnsi" w:cstheme="minorBidi" w:eastAsiaTheme="minorEastAsia" w:hAnsiTheme="minorHAnsi"/>
                         </w:rPr>
                         <w:t xml:space="preserve"> τετ.</w:t>
                       </w:r>
                     </w:p>
                   </w:txbxContent>
                 </v:textbox>
-                <v:fill o:detectmouseclick="t" on="false"/>
-                <v:stroke color="black" joinstyle="round" endcap="flat"/>
                 <w10:wrap type="none"/>
-              </v:shape>
+              </v:rect>
             </w:pict>
           </mc:Fallback>
         </mc:AlternateContent>
         <mc:AlternateContent>
           <mc:Choice Requires="wps">
             <w:drawing>
-              <wp:anchor behindDoc="0" distT="0" distB="0" distL="0" distR="0" simplePos="0" locked="0" layoutInCell="0" allowOverlap="1" relativeHeight="9">
+              <wp:anchor behindDoc="0" distT="0" distB="0" distL="0" distR="0" simplePos="0" locked="0" layoutInCell="0" allowOverlap="1" relativeHeight="10">
                 <wp:simplePos x="0" y="0"/>
                 <wp:positionH relativeFrom="column">
                   <wp:posOffset>1270635</wp:posOffset>
@@ -5752,11 +5847,11 @@
                 <wp:extent cx="352425" cy="325755"/>
                 <wp:effectExtent l="0" t="0" r="0" b="0"/>
                 <wp:wrapNone/>
-                <wp:docPr id="8" name="Text Frame 2"/>
+                <wp:docPr id="9" name="Text Frame 2"/>
                 <a:graphic xmlns:a="http://schemas.openxmlformats.org/drawingml/2006/main">
                   <a:graphicData uri="http://schemas.microsoft.com/office/word/2010/wordprocessingShape">
                     <wps:wsp>
-                      <wps:cNvSpPr txBox="1"/>
+                      <wps:cNvSpPr/>
                       <wps:spPr>
                         <a:xfrm>
                           <a:off x="0" y="0"/>
@@ -5770,47 +5865,58 @@
                           <a:noFill/>
                         </a:ln>
                       </wps:spPr>
+                      <wps:style>
+                        <a:lnRef idx="0"/>
+                        <a:fillRef idx="0"/>
+                        <a:effectRef idx="0"/>
+                        <a:fontRef idx="minor"/>
+                      </wps:style>
                       <wps:txbx>
                         <w:txbxContent>
                           <w:p>
                             <w:pPr>
+                              <w:pStyle w:val="FrameContents"/>
                               <w:overflowPunct w:val="false"/>
-                              <w:spacing w:before="0" w:after="0" w:lineRule="auto" w:line="240"/>
-                              <w:rPr/>
+                              <w:spacing w:lineRule="auto" w:line="240" w:before="0" w:after="0"/>
+                              <w:rPr>
+                                <w:color w:val="000000"/>
+                              </w:rPr>
                             </w:pPr>
                             <w:r>
                               <w:rPr>
-                                <w:sz w:val="22"/>
-                                <w:vertAlign w:val="superscript"/>
-                                <w:vertAlign w:val="baseline"/>
+                                <w:rFonts w:eastAsia="ＭＳ 明朝" w:cs="" w:ascii="Cambria" w:hAnsi="Cambria" w:asciiTheme="minorHAnsi" w:cstheme="minorBidi" w:eastAsiaTheme="minorEastAsia" w:hAnsiTheme="minorHAnsi"/>
+                                <w:color w:val="000000"/>
                                 <w:position w:val="0"/>
                                 <w:sz w:val="22"/>
-                                <w:rFonts w:ascii="Cambria" w:hAnsi="Cambria" w:eastAsia="ＭＳ 明朝" w:asciiTheme="minorHAnsi" w:cstheme="minorBidi" w:eastAsiaTheme="minorEastAsia" w:hAnsiTheme="minorHAnsi"/>
+                                <w:sz w:val="22"/>
+                                <w:vertAlign w:val="baseline"/>
                               </w:rPr>
                               <w:t>2</w:t>
                             </w:r>
                             <w:r>
                               <w:rPr>
+                                <w:rFonts w:eastAsia="ＭＳ 明朝" w:cs="" w:ascii="Cambria" w:hAnsi="Cambria" w:asciiTheme="minorHAnsi" w:cstheme="minorBidi" w:eastAsiaTheme="minorEastAsia" w:hAnsiTheme="minorHAnsi"/>
+                                <w:color w:val="000000"/>
                                 <w:sz w:val="22"/>
                                 <w:vertAlign w:val="superscript"/>
-                                <w:rFonts w:ascii="Cambria" w:hAnsi="Cambria" w:eastAsia="ＭＳ 明朝" w:asciiTheme="minorHAnsi" w:cstheme="minorBidi" w:eastAsiaTheme="minorEastAsia" w:hAnsiTheme="minorHAnsi"/>
                               </w:rPr>
                               <w:t>ο</w:t>
                             </w:r>
                             <w:r>
                               <w:rPr>
+                                <w:rFonts w:eastAsia="ＭＳ 明朝" w:cs="" w:ascii="Cambria" w:hAnsi="Cambria" w:asciiTheme="minorHAnsi" w:cstheme="minorBidi" w:eastAsiaTheme="minorEastAsia" w:hAnsiTheme="minorHAnsi"/>
+                                <w:color w:val="000000"/>
+                                <w:position w:val="0"/>
+                                <w:sz w:val="22"/>
                                 <w:sz w:val="22"/>
                                 <w:vertAlign w:val="baseline"/>
-                                <w:position w:val="0"/>
-                                <w:sz w:val="22"/>
-                                <w:rFonts w:ascii="Cambria" w:hAnsi="Cambria" w:eastAsia="ＭＳ 明朝" w:asciiTheme="minorHAnsi" w:cstheme="minorBidi" w:eastAsiaTheme="minorEastAsia" w:hAnsiTheme="minorHAnsi"/>
                               </w:rPr>
                               <w:t xml:space="preserve"> τετ.</w:t>
                             </w:r>
                           </w:p>
                         </w:txbxContent>
                       </wps:txbx>
-                      <wps:bodyPr wrap="square" lIns="0" rIns="0" tIns="0" bIns="0" anchor="t">
+                      <wps:bodyPr lIns="0" rIns="0" tIns="0" bIns="0" anchor="t">
                         <a:noAutofit/>
                       </wps:bodyPr>
                     </wps:wsp>
@@ -5821,51 +5927,56 @@
           </mc:Choice>
           <mc:Fallback>
             <w:pict>
-              <v:shape id="shape_0" ID="Text Frame 2" stroked="f" o:allowincell="f" style="position:absolute;margin-left:100.05pt;margin-top:14.5pt;width:27.7pt;height:25.6pt;mso-wrap-style:square;v-text-anchor:top" type="_x0000_t202">
+              <v:rect id="shape_0" ID="Text Frame 2" path="m0,0l-2147483645,0l-2147483645,-2147483646l0,-2147483646xe" stroked="f" o:allowincell="f" style="position:absolute;margin-left:100.05pt;margin-top:14.5pt;width:27.7pt;height:25.6pt;mso-wrap-style:square;v-text-anchor:top">
+                <v:fill o:detectmouseclick="t" on="false"/>
+                <v:stroke color="#3465a4" joinstyle="round" endcap="flat"/>
                 <v:textbox>
                   <w:txbxContent>
                     <w:p>
                       <w:pPr>
+                        <w:pStyle w:val="FrameContents"/>
                         <w:overflowPunct w:val="false"/>
-                        <w:spacing w:before="0" w:after="0" w:lineRule="auto" w:line="240"/>
-                        <w:rPr/>
+                        <w:spacing w:lineRule="auto" w:line="240" w:before="0" w:after="0"/>
+                        <w:rPr>
+                          <w:color w:val="000000"/>
+                        </w:rPr>
                       </w:pPr>
                       <w:r>
                         <w:rPr>
-                          <w:sz w:val="22"/>
-                          <w:vertAlign w:val="superscript"/>
-                          <w:vertAlign w:val="baseline"/>
+                          <w:rFonts w:eastAsia="ＭＳ 明朝" w:cs="" w:ascii="Cambria" w:hAnsi="Cambria" w:asciiTheme="minorHAnsi" w:cstheme="minorBidi" w:eastAsiaTheme="minorEastAsia" w:hAnsiTheme="minorHAnsi"/>
+                          <w:color w:val="000000"/>
                           <w:position w:val="0"/>
                           <w:sz w:val="22"/>
-                          <w:rFonts w:ascii="Cambria" w:hAnsi="Cambria" w:eastAsia="ＭＳ 明朝" w:asciiTheme="minorHAnsi" w:cstheme="minorBidi" w:eastAsiaTheme="minorEastAsia" w:hAnsiTheme="minorHAnsi"/>
+                          <w:sz w:val="22"/>
+                          <w:vertAlign w:val="baseline"/>
                         </w:rPr>
                         <w:t>2</w:t>
                       </w:r>
                       <w:r>
                         <w:rPr>
+                          <w:rFonts w:eastAsia="ＭＳ 明朝" w:cs="" w:ascii="Cambria" w:hAnsi="Cambria" w:asciiTheme="minorHAnsi" w:cstheme="minorBidi" w:eastAsiaTheme="minorEastAsia" w:hAnsiTheme="minorHAnsi"/>
+                          <w:color w:val="000000"/>
                           <w:sz w:val="22"/>
                           <w:vertAlign w:val="superscript"/>
-                          <w:rFonts w:ascii="Cambria" w:hAnsi="Cambria" w:eastAsia="ＭＳ 明朝" w:asciiTheme="minorHAnsi" w:cstheme="minorBidi" w:eastAsiaTheme="minorEastAsia" w:hAnsiTheme="minorHAnsi"/>
                         </w:rPr>
                         <w:t>ο</w:t>
                       </w:r>
                       <w:r>
                         <w:rPr>
+                          <w:rFonts w:eastAsia="ＭＳ 明朝" w:cs="" w:ascii="Cambria" w:hAnsi="Cambria" w:asciiTheme="minorHAnsi" w:cstheme="minorBidi" w:eastAsiaTheme="minorEastAsia" w:hAnsiTheme="minorHAnsi"/>
+                          <w:color w:val="000000"/>
+                          <w:position w:val="0"/>
+                          <w:sz w:val="22"/>
                           <w:sz w:val="22"/>
                           <w:vertAlign w:val="baseline"/>
-                          <w:position w:val="0"/>
-                          <w:sz w:val="22"/>
-                          <w:rFonts w:ascii="Cambria" w:hAnsi="Cambria" w:eastAsia="ＭＳ 明朝" w:asciiTheme="minorHAnsi" w:cstheme="minorBidi" w:eastAsiaTheme="minorEastAsia" w:hAnsiTheme="minorHAnsi"/>
                         </w:rPr>
                         <w:t xml:space="preserve"> τετ.</w:t>
                       </w:r>
                     </w:p>
                   </w:txbxContent>
                 </v:textbox>
-                <v:fill o:detectmouseclick="t" on="false"/>
-                <v:stroke color="black" joinstyle="round" endcap="flat"/>
                 <w10:wrap type="none"/>
-              </v:shape>
+              </v:rect>
             </w:pict>
           </mc:Fallback>
         </mc:AlternateContent>
@@ -6344,15 +6455,9 @@
       </w:pPr>
       <w:r>
         <w:rPr>
-          <w:b w:val="false"/>
-          <w:bCs w:val="false"/>
-          <w:color w:val="000000"/>
-          <w:position w:val="0"/>
-          <w:sz w:val="24"/>
-          <w:sz w:val="24"/>
-          <w:szCs w:val="24"/>
-          <w:u w:val="none"/>
-          <w:vertAlign w:val="baseline"/>
+          <w:rFonts w:eastAsia="Arial" w:cs="" w:cstheme="minorBidi" w:ascii="Calibri" w:hAnsi="Calibri"/>
+          <w:kern w:val="0"/>
+          <w:lang w:val="en-US" w:eastAsia="en-US" w:bidi="ar-SA"/>
         </w:rPr>
       </w:r>
     </w:p>
@@ -6408,7 +6513,7 @@
       </w:tblPr>
       <w:tblGrid>
         <w:gridCol w:w="1800"/>
-        <w:gridCol w:w="1800"/>
+        <w:gridCol w:w="1799"/>
       </w:tblGrid>
       <w:tr>
         <w:trPr/>
@@ -6420,6 +6525,7 @@
           <w:p>
             <w:pPr>
               <w:pStyle w:val="TableContents"/>
+              <w:widowControl w:val="false"/>
               <w:spacing w:before="0" w:after="200"/>
               <w:jc w:val="center"/>
               <w:rPr/>
@@ -6443,12 +6549,13 @@
         </w:tc>
         <w:tc>
           <w:tcPr>
-            <w:tcW w:w="1800" w:type="dxa"/>
+            <w:tcW w:w="1799" w:type="dxa"/>
             <w:tcBorders/>
           </w:tcPr>
           <w:p>
             <w:pPr>
               <w:pStyle w:val="TableContents"/>
+              <w:widowControl w:val="false"/>
               <w:spacing w:before="0" w:after="200"/>
               <w:jc w:val="center"/>
               <w:rPr/>
@@ -6481,6 +6588,7 @@
           <w:p>
             <w:pPr>
               <w:pStyle w:val="TableContents"/>
+              <w:widowControl w:val="false"/>
               <w:spacing w:before="0" w:after="200"/>
               <w:jc w:val="center"/>
               <w:rPr/>
@@ -6493,12 +6601,13 @@
         </w:tc>
         <w:tc>
           <w:tcPr>
-            <w:tcW w:w="1800" w:type="dxa"/>
+            <w:tcW w:w="1799" w:type="dxa"/>
             <w:tcBorders/>
           </w:tcPr>
           <w:p>
             <w:pPr>
               <w:pStyle w:val="TableContents"/>
+              <w:widowControl w:val="false"/>
               <w:spacing w:before="0" w:after="200"/>
               <w:jc w:val="center"/>
               <w:rPr/>
@@ -6526,6 +6635,7 @@
           <w:p>
             <w:pPr>
               <w:pStyle w:val="TableContents"/>
+              <w:widowControl w:val="false"/>
               <w:spacing w:before="0" w:after="200"/>
               <w:jc w:val="center"/>
               <w:rPr/>
@@ -6538,12 +6648,13 @@
         </w:tc>
         <w:tc>
           <w:tcPr>
-            <w:tcW w:w="1800" w:type="dxa"/>
+            <w:tcW w:w="1799" w:type="dxa"/>
             <w:tcBorders/>
           </w:tcPr>
           <w:p>
             <w:pPr>
               <w:pStyle w:val="TableContents"/>
+              <w:widowControl w:val="false"/>
               <w:spacing w:before="0" w:after="200"/>
               <w:jc w:val="center"/>
               <w:rPr/>
@@ -6571,6 +6682,7 @@
           <w:p>
             <w:pPr>
               <w:pStyle w:val="TableContents"/>
+              <w:widowControl w:val="false"/>
               <w:spacing w:before="0" w:after="200"/>
               <w:jc w:val="center"/>
               <w:rPr/>
@@ -6583,12 +6695,13 @@
         </w:tc>
         <w:tc>
           <w:tcPr>
-            <w:tcW w:w="1800" w:type="dxa"/>
+            <w:tcW w:w="1799" w:type="dxa"/>
             <w:tcBorders/>
           </w:tcPr>
           <w:p>
             <w:pPr>
               <w:pStyle w:val="TableContents"/>
+              <w:widowControl w:val="false"/>
               <w:spacing w:before="0" w:after="200"/>
               <w:jc w:val="center"/>
               <w:rPr/>
@@ -6615,15 +6728,9 @@
       </w:pPr>
       <w:r>
         <w:rPr>
-          <w:b w:val="false"/>
-          <w:bCs w:val="false"/>
-          <w:color w:val="000000"/>
-          <w:position w:val="0"/>
-          <w:sz w:val="24"/>
-          <w:sz w:val="24"/>
-          <w:szCs w:val="24"/>
-          <w:u w:val="none"/>
-          <w:vertAlign w:val="baseline"/>
+          <w:rFonts w:eastAsia="Arial" w:cs="" w:cstheme="minorBidi" w:ascii="Calibri" w:hAnsi="Calibri"/>
+          <w:kern w:val="0"/>
+          <w:lang w:val="en-US" w:eastAsia="en-US" w:bidi="ar-SA"/>
         </w:rPr>
       </w:r>
     </w:p>
@@ -6661,7 +6768,22 @@
           <w:vertAlign w:val="baseline"/>
           <w:lang w:val="en-US" w:eastAsia="en-US" w:bidi="ar-SA"/>
         </w:rPr>
-        <w:t>Η τιμή</w:t>
+        <w:t>Η τιμή y του βραχίονα θα είναι σταθερή, καθώς εξαρτάται από το ύψος των κομματιών της δοθείσας σκακιέρας και αποτελεί την 3</w:t>
+      </w:r>
+      <w:r>
+        <w:rPr>
+          <w:rFonts w:eastAsia="Arial" w:cs="" w:ascii="Calibri" w:hAnsi="Calibri" w:cstheme="minorBidi"/>
+          <w:b w:val="false"/>
+          <w:bCs w:val="false"/>
+          <w:color w:val="000000"/>
+          <w:kern w:val="0"/>
+          <w:sz w:val="24"/>
+          <w:szCs w:val="24"/>
+          <w:u w:val="none"/>
+          <w:vertAlign w:val="superscript"/>
+          <w:lang w:val="en-US" w:eastAsia="en-US" w:bidi="ar-SA"/>
+        </w:rPr>
+        <w:t>η</w:t>
       </w:r>
       <w:r>
         <w:rPr>
@@ -6678,90 +6800,7 @@
           <w:vertAlign w:val="baseline"/>
           <w:lang w:val="en-US" w:eastAsia="en-US" w:bidi="ar-SA"/>
         </w:rPr>
-        <w:t xml:space="preserve"> y του βραχίονα θα είναι σταθερ</w:t>
-      </w:r>
-      <w:r>
-        <w:rPr>
-          <w:rFonts w:eastAsia="Arial" w:cs="" w:ascii="Calibri" w:hAnsi="Calibri" w:cstheme="minorBidi"/>
-          <w:b w:val="false"/>
-          <w:bCs w:val="false"/>
-          <w:color w:val="000000"/>
-          <w:kern w:val="0"/>
-          <w:position w:val="0"/>
-          <w:sz w:val="24"/>
-          <w:sz w:val="24"/>
-          <w:szCs w:val="24"/>
-          <w:u w:val="none"/>
-          <w:vertAlign w:val="baseline"/>
-          <w:lang w:val="en-US" w:eastAsia="en-US" w:bidi="ar-SA"/>
-        </w:rPr>
-        <w:t>ή</w:t>
-      </w:r>
-      <w:r>
-        <w:rPr>
-          <w:rFonts w:eastAsia="Arial" w:cs="" w:ascii="Calibri" w:hAnsi="Calibri" w:cstheme="minorBidi"/>
-          <w:b w:val="false"/>
-          <w:bCs w:val="false"/>
-          <w:color w:val="000000"/>
-          <w:kern w:val="0"/>
-          <w:position w:val="0"/>
-          <w:sz w:val="24"/>
-          <w:sz w:val="24"/>
-          <w:szCs w:val="24"/>
-          <w:u w:val="none"/>
-          <w:vertAlign w:val="baseline"/>
-          <w:lang w:val="en-US" w:eastAsia="en-US" w:bidi="ar-SA"/>
-        </w:rPr>
-        <w:t>, καθώς εξαρτάται από το ύψος των κομματιών της δοθείσας σκακιέρας και αποτελεί την 3</w:t>
-      </w:r>
-      <w:r>
-        <w:rPr>
-          <w:rFonts w:eastAsia="Arial" w:cs="" w:ascii="Calibri" w:hAnsi="Calibri" w:cstheme="minorBidi"/>
-          <w:b w:val="false"/>
-          <w:bCs w:val="false"/>
-          <w:color w:val="000000"/>
-          <w:kern w:val="0"/>
-          <w:sz w:val="24"/>
-          <w:szCs w:val="24"/>
-          <w:u w:val="none"/>
-          <w:vertAlign w:val="superscript"/>
-          <w:lang w:val="en-US" w:eastAsia="en-US" w:bidi="ar-SA"/>
-        </w:rPr>
-        <w:t>η</w:t>
-      </w:r>
-      <w:r>
-        <w:rPr>
-          <w:rFonts w:eastAsia="Arial" w:cs="" w:ascii="Calibri" w:hAnsi="Calibri" w:cstheme="minorBidi"/>
-          <w:b w:val="false"/>
-          <w:bCs w:val="false"/>
-          <w:color w:val="000000"/>
-          <w:kern w:val="0"/>
-          <w:position w:val="0"/>
-          <w:sz w:val="24"/>
-          <w:sz w:val="24"/>
-          <w:szCs w:val="24"/>
-          <w:u w:val="none"/>
-          <w:vertAlign w:val="baseline"/>
-          <w:lang w:val="en-US" w:eastAsia="en-US" w:bidi="ar-SA"/>
-        </w:rPr>
-        <w:t xml:space="preserve"> διάσταση </w:t>
-      </w:r>
-      <w:r>
-        <w:rPr>
-          <w:rFonts w:eastAsia="Arial" w:cs="" w:ascii="Calibri" w:hAnsi="Calibri" w:cstheme="minorBidi"/>
-          <w:b w:val="false"/>
-          <w:bCs w:val="false"/>
-          <w:color w:val="000000"/>
-          <w:kern w:val="0"/>
-          <w:position w:val="0"/>
-          <w:sz w:val="24"/>
-          <w:sz w:val="24"/>
-          <w:szCs w:val="24"/>
-          <w:u w:val="none"/>
-          <w:vertAlign w:val="baseline"/>
-          <w:lang w:val="en-US" w:eastAsia="en-US" w:bidi="ar-SA"/>
-        </w:rPr>
-        <w:t>του βραχίονα. Η τιμή της μεταβλητής y θα οριστεί πειραματικά.</w:t>
+        <w:t xml:space="preserve"> διάσταση του βραχίονα. Η τιμή της μεταβλητής y θα οριστεί πειραματικά.</w:t>
       </w:r>
     </w:p>
     <w:p>
@@ -6778,15 +6817,9 @@
       </w:pPr>
       <w:r>
         <w:rPr>
-          <w:b w:val="false"/>
-          <w:bCs w:val="false"/>
-          <w:color w:val="000000"/>
-          <w:position w:val="0"/>
-          <w:sz w:val="24"/>
-          <w:sz w:val="24"/>
-          <w:szCs w:val="24"/>
-          <w:u w:val="none"/>
-          <w:vertAlign w:val="baseline"/>
+          <w:rFonts w:eastAsia="Arial" w:cs="" w:cstheme="minorBidi" w:ascii="Calibri" w:hAnsi="Calibri"/>
+          <w:kern w:val="0"/>
+          <w:lang w:val="en-US" w:eastAsia="en-US" w:bidi="ar-SA"/>
         </w:rPr>
       </w:r>
     </w:p>
@@ -6804,15 +6837,9 @@
       </w:pPr>
       <w:r>
         <w:rPr>
-          <w:b w:val="false"/>
-          <w:bCs w:val="false"/>
-          <w:color w:val="000000"/>
-          <w:position w:val="0"/>
-          <w:sz w:val="24"/>
-          <w:sz w:val="24"/>
-          <w:szCs w:val="24"/>
-          <w:u w:val="none"/>
-          <w:vertAlign w:val="baseline"/>
+          <w:rFonts w:eastAsia="Arial" w:cs="" w:cstheme="minorBidi" w:ascii="Calibri" w:hAnsi="Calibri"/>
+          <w:kern w:val="0"/>
+          <w:lang w:val="en-US" w:eastAsia="en-US" w:bidi="ar-SA"/>
         </w:rPr>
       </w:r>
     </w:p>
@@ -6853,20 +6880,7 @@
         <w:t xml:space="preserve">Ισχύει: </w:t>
       </w:r>
       <w:r>
-        <w:rPr>
-          <w:rFonts w:eastAsia="Arial" w:cs="" w:ascii="Calibri" w:hAnsi="Calibri" w:cstheme="minorBidi"/>
-          <w:b w:val="false"/>
-          <w:bCs w:val="false"/>
-          <w:color w:val="000000"/>
-          <w:kern w:val="0"/>
-          <w:position w:val="0"/>
-          <w:sz w:val="24"/>
-          <w:sz w:val="24"/>
-          <w:szCs w:val="24"/>
-          <w:u w:val="none"/>
-          <w:vertAlign w:val="baseline"/>
-          <w:lang w:val="en-US" w:eastAsia="en-US" w:bidi="ar-SA"/>
-        </w:rPr>
+        <w:rPr/>
       </w:r>
       <m:oMath xmlns:m="http://schemas.openxmlformats.org/officeDocument/2006/math">
         <m:r>
@@ -6932,36 +6946,17 @@
           <w:vertAlign w:val="baseline"/>
           <w:lang w:val="en-US" w:eastAsia="en-US" w:bidi="ar-SA"/>
         </w:rPr>
-        <w:t xml:space="preserve">, όπου </w:t>
-      </w:r>
-      <w:r>
-        <w:rPr>
-          <w:rFonts w:eastAsia="Arial" w:cs="" w:ascii="Calibri" w:hAnsi="Calibri" w:cstheme="minorBidi"/>
-          <w:b w:val="false"/>
-          <w:bCs w:val="false"/>
-          <w:color w:val="000000"/>
-          <w:kern w:val="0"/>
-          <w:position w:val="0"/>
-          <w:sz w:val="24"/>
-          <w:sz w:val="24"/>
-          <w:szCs w:val="24"/>
-          <w:u w:val="none"/>
-          <w:vertAlign w:val="baseline"/>
-          <w:lang w:val="en-US" w:eastAsia="en-US" w:bidi="ar-SA"/>
-        </w:rPr>
+        <w:t xml:space="preserve">, </w:t>
+      </w:r>
+      <w:r>
+        <w:rPr/>
       </w:r>
       <m:oMath xmlns:m="http://schemas.openxmlformats.org/officeDocument/2006/math">
         <m:r>
           <w:rPr>
             <w:rFonts w:ascii="Cambria Math" w:hAnsi="Cambria Math"/>
           </w:rPr>
-          <m:t xml:space="preserve">0</m:t>
-        </m:r>
-        <m:r>
-          <w:rPr>
-            <w:rFonts w:ascii="Cambria Math" w:hAnsi="Cambria Math"/>
-          </w:rPr>
-          <m:t xml:space="preserve">≤</m:t>
+          <m:t xml:space="preserve">∀</m:t>
         </m:r>
         <m:r>
           <w:rPr>
@@ -6973,14 +6968,34 @@
           <w:rPr>
             <w:rFonts w:ascii="Cambria Math" w:hAnsi="Cambria Math"/>
           </w:rPr>
-          <m:t xml:space="preserve">≤</m:t>
+          <m:t xml:space="preserve">∈</m:t>
         </m:r>
-        <m:r>
-          <w:rPr>
-            <w:rFonts w:ascii="Cambria Math" w:hAnsi="Cambria Math"/>
-          </w:rPr>
-          <m:t xml:space="preserve">π</m:t>
-        </m:r>
+        <m:d>
+          <m:dPr>
+            <m:begChr m:val="("/>
+            <m:endChr m:val=")"/>
+          </m:dPr>
+          <m:e>
+            <m:r>
+              <w:rPr>
+                <w:rFonts w:ascii="Cambria Math" w:hAnsi="Cambria Math"/>
+              </w:rPr>
+              <m:t xml:space="preserve">0</m:t>
+            </m:r>
+            <m:r>
+              <w:rPr>
+                <w:rFonts w:ascii="Cambria Math" w:hAnsi="Cambria Math"/>
+              </w:rPr>
+              <m:t xml:space="preserve">,</m:t>
+            </m:r>
+            <m:r>
+              <w:rPr>
+                <w:rFonts w:ascii="Cambria Math" w:hAnsi="Cambria Math"/>
+              </w:rPr>
+              <m:t xml:space="preserve">π</m:t>
+            </m:r>
+          </m:e>
+        </m:d>
       </m:oMath>
       <w:r>
         <w:rPr>
@@ -7000,20 +7015,7 @@
         <w:t xml:space="preserve"> ⇒ </w:t>
       </w:r>
       <w:r>
-        <w:rPr>
-          <w:rFonts w:eastAsia="Arial" w:cs="" w:ascii="Calibri" w:hAnsi="Calibri" w:cstheme="minorBidi"/>
-          <w:b w:val="false"/>
-          <w:bCs w:val="false"/>
-          <w:color w:val="000000"/>
-          <w:kern w:val="0"/>
-          <w:position w:val="0"/>
-          <w:sz w:val="24"/>
-          <w:sz w:val="24"/>
-          <w:szCs w:val="24"/>
-          <w:u w:val="none"/>
-          <w:vertAlign w:val="baseline"/>
-          <w:lang w:val="en-US" w:eastAsia="en-US" w:bidi="ar-SA"/>
-        </w:rPr>
+        <w:rPr/>
       </w:r>
       <m:oMath xmlns:m="http://schemas.openxmlformats.org/officeDocument/2006/math">
         <m:r>
@@ -7069,7 +7071,22 @@
                   </m:e>
                 </m:d>
                 <m:r>
-                  <m:t xml:space="preserve"> </m:t>
+                  <w:rPr>
+                    <w:rFonts w:ascii="Cambria Math" w:hAnsi="Cambria Math"/>
+                  </w:rPr>
+                  <m:t xml:space="preserve">,</m:t>
+                </m:r>
+                <m:r>
+                  <w:rPr>
+                    <w:rFonts w:ascii="Cambria Math" w:hAnsi="Cambria Math"/>
+                  </w:rPr>
+                  <m:t xml:space="preserve">0</m:t>
+                </m:r>
+                <m:r>
+                  <w:rPr>
+                    <w:rFonts w:ascii="Cambria Math" w:hAnsi="Cambria Math"/>
+                  </w:rPr>
+                  <m:t xml:space="preserve">≤</m:t>
                 </m:r>
                 <m:r>
                   <w:rPr>
@@ -7081,13 +7098,13 @@
                   <w:rPr>
                     <w:rFonts w:ascii="Cambria Math" w:hAnsi="Cambria Math"/>
                   </w:rPr>
-                  <m:t xml:space="preserve">≥</m:t>
+                  <m:t xml:space="preserve">≤</m:t>
                 </m:r>
                 <m:r>
                   <w:rPr>
                     <w:rFonts w:ascii="Cambria Math" w:hAnsi="Cambria Math"/>
                   </w:rPr>
-                  <m:t xml:space="preserve">0</m:t>
+                  <m:t xml:space="preserve">9.1875</m:t>
                 </m:r>
               </m:e>
               <m:e>
@@ -7136,7 +7153,28 @@
                   <m:t xml:space="preserve">π</m:t>
                 </m:r>
                 <m:r>
-                  <m:t xml:space="preserve"> </m:t>
+                  <w:rPr>
+                    <w:rFonts w:ascii="Cambria Math" w:hAnsi="Cambria Math"/>
+                  </w:rPr>
+                  <m:t xml:space="preserve">,</m:t>
+                </m:r>
+                <m:r>
+                  <w:rPr>
+                    <w:rFonts w:ascii="Cambria Math" w:hAnsi="Cambria Math"/>
+                  </w:rPr>
+                  <m:t xml:space="preserve">−</m:t>
+                </m:r>
+                <m:r>
+                  <w:rPr>
+                    <w:rFonts w:ascii="Cambria Math" w:hAnsi="Cambria Math"/>
+                  </w:rPr>
+                  <m:t xml:space="preserve">12.25</m:t>
+                </m:r>
+                <m:r>
+                  <w:rPr>
+                    <w:rFonts w:ascii="Cambria Math" w:hAnsi="Cambria Math"/>
+                  </w:rPr>
+                  <m:t xml:space="preserve">≤</m:t>
                 </m:r>
                 <m:r>
                   <w:rPr>
@@ -7176,24 +7214,7 @@
           <w:vertAlign w:val="baseline"/>
           <w:lang w:val="en-US" w:eastAsia="en-US" w:bidi="ar-SA"/>
         </w:rPr>
-        <w:t>.</w:t>
-      </w:r>
-      <w:r>
-        <w:rPr>
-          <w:rFonts w:eastAsia="Arial" w:cs="" w:ascii="Calibri" w:hAnsi="Calibri" w:cstheme="minorBidi"/>
-          <w:b w:val="false"/>
-          <w:bCs w:val="false"/>
-          <w:color w:val="000000"/>
-          <w:kern w:val="0"/>
-          <w:position w:val="0"/>
-          <w:sz w:val="24"/>
-          <w:sz w:val="24"/>
-          <w:szCs w:val="24"/>
-          <w:u w:val="none"/>
-          <w:vertAlign w:val="baseline"/>
-          <w:lang w:val="en-US" w:eastAsia="en-US" w:bidi="ar-SA"/>
-        </w:rPr>
-        <w:t xml:space="preserve"> Αυτό συμβαίνει διότι η συνάρτηση arctan δίνει πίσω λύσεις για 1</w:t>
+        <w:t>. Αυτό συμβαίνει διότι η συνάρτηση arctan δίνει πίσω λύσεις για 1</w:t>
       </w:r>
       <w:r>
         <w:rPr>
@@ -7260,17 +7281,7 @@
         <w:t xml:space="preserve">. Για </w:t>
       </w:r>
       <w:r>
-        <w:rPr>
-          <w:b w:val="false"/>
-          <w:bCs w:val="false"/>
-          <w:color w:val="000000"/>
-          <w:position w:val="0"/>
-          <w:sz w:val="24"/>
-          <w:sz w:val="24"/>
-          <w:szCs w:val="24"/>
-          <w:u w:val="none"/>
-          <w:vertAlign w:val="baseline"/>
-        </w:rPr>
+        <w:rPr/>
       </w:r>
       <m:oMath xmlns:m="http://schemas.openxmlformats.org/officeDocument/2006/math">
         <m:r>
@@ -7387,20 +7398,10 @@
           <w:vertAlign w:val="baseline"/>
           <w:lang w:val="en-US" w:eastAsia="en-US" w:bidi="ar-SA"/>
         </w:rPr>
-        <w:t xml:space="preserve"> και δεν υπάρχει πρόβλημα, όμως για</w:t>
-      </w:r>
-      <w:r>
-        <w:rPr>
-          <w:b w:val="false"/>
-          <w:bCs w:val="false"/>
-          <w:color w:val="000000"/>
-          <w:position w:val="0"/>
-          <w:sz w:val="24"/>
-          <w:sz w:val="24"/>
-          <w:szCs w:val="24"/>
-          <w:u w:val="none"/>
-          <w:vertAlign w:val="baseline"/>
-        </w:rPr>
+        <w:t xml:space="preserve"> και δεν υπάρχει πρόβλημα, όμως για </w:t>
+      </w:r>
+      <w:r>
+        <w:rPr/>
       </w:r>
       <m:oMath xmlns:m="http://schemas.openxmlformats.org/officeDocument/2006/math">
         <m:r>
@@ -7423,6 +7424,10 @@
         </m:r>
       </m:oMath>
       <w:r>
+        <w:rPr/>
+        <w:t xml:space="preserve"> ,</w:t>
+      </w:r>
+      <w:r>
         <w:rPr>
           <w:b w:val="false"/>
           <w:bCs w:val="false"/>
@@ -7451,75 +7456,7 @@
           <w:vertAlign w:val="baseline"/>
           <w:lang w:val="en-US" w:eastAsia="en-US" w:bidi="ar-SA"/>
         </w:rPr>
-        <w:t xml:space="preserve">έπει να μετατοπιστεί η γωνία ω κατά π, έτσι ώστε </w:t>
-      </w:r>
-      <w:r>
-        <w:rPr>
-          <w:rFonts w:eastAsia="Arial" w:cs="" w:cstheme="minorBidi"/>
-          <w:b w:val="false"/>
-          <w:bCs w:val="false"/>
-          <w:color w:val="000000"/>
-          <w:kern w:val="0"/>
-          <w:position w:val="0"/>
-          <w:sz w:val="24"/>
-          <w:sz w:val="24"/>
-          <w:szCs w:val="24"/>
-          <w:u w:val="none"/>
-          <w:vertAlign w:val="baseline"/>
-          <w:lang w:val="en-US" w:eastAsia="en-US" w:bidi="ar-SA"/>
-        </w:rPr>
-        <w:t>η λύση</w:t>
-      </w:r>
-      <w:r>
-        <w:rPr>
-          <w:rFonts w:eastAsia="Arial" w:cs="" w:cstheme="minorBidi"/>
-          <w:b w:val="false"/>
-          <w:bCs w:val="false"/>
-          <w:color w:val="000000"/>
-          <w:kern w:val="0"/>
-          <w:position w:val="0"/>
-          <w:sz w:val="24"/>
-          <w:sz w:val="24"/>
-          <w:szCs w:val="24"/>
-          <w:u w:val="none"/>
-          <w:vertAlign w:val="baseline"/>
-          <w:lang w:val="en-US" w:eastAsia="en-US" w:bidi="ar-SA"/>
-        </w:rPr>
-        <w:t xml:space="preserve"> </w:t>
-      </w:r>
-      <w:r>
-        <w:rPr>
-          <w:rFonts w:eastAsia="Arial" w:cs="" w:cstheme="minorBidi"/>
-          <w:b w:val="false"/>
-          <w:bCs w:val="false"/>
-          <w:color w:val="000000"/>
-          <w:kern w:val="0"/>
-          <w:position w:val="0"/>
-          <w:sz w:val="24"/>
-          <w:sz w:val="24"/>
-          <w:szCs w:val="24"/>
-          <w:u w:val="none"/>
-          <w:vertAlign w:val="baseline"/>
-          <w:lang w:val="en-US" w:eastAsia="en-US" w:bidi="ar-SA"/>
-        </w:rPr>
-        <w:t xml:space="preserve">να βρεθεί </w:t>
-      </w:r>
-      <w:r>
-        <w:rPr>
-          <w:rFonts w:eastAsia="Arial" w:cs="" w:cstheme="minorBidi"/>
-          <w:b w:val="false"/>
-          <w:bCs w:val="false"/>
-          <w:color w:val="000000"/>
-          <w:kern w:val="0"/>
-          <w:position w:val="0"/>
-          <w:sz w:val="24"/>
-          <w:sz w:val="24"/>
-          <w:szCs w:val="24"/>
-          <w:u w:val="none"/>
-          <w:vertAlign w:val="baseline"/>
-          <w:lang w:val="en-US" w:eastAsia="en-US" w:bidi="ar-SA"/>
-        </w:rPr>
-        <w:t xml:space="preserve">από το  </w:t>
+        <w:t xml:space="preserve">έπει να μετατοπιστεί η γωνία ω κατά π, έτσι ώστε η λύση να βρεθεί από το  </w:t>
       </w:r>
       <w:r>
         <w:rPr>
@@ -7601,6 +7538,101 @@
           <w:lang w:val="en-US" w:eastAsia="en-US" w:bidi="ar-SA"/>
         </w:rPr>
         <w:t>τεταρτημόριο.</w:t>
+      </w:r>
+      <w:r>
+        <w:rPr>
+          <w:rFonts w:eastAsia="Arial" w:cs="" w:ascii="Calibri" w:hAnsi="Calibri" w:cstheme="minorBidi"/>
+          <w:b w:val="false"/>
+          <w:bCs w:val="false"/>
+          <w:color w:val="000000"/>
+          <w:kern w:val="0"/>
+          <w:position w:val="0"/>
+          <w:sz w:val="24"/>
+          <w:sz w:val="24"/>
+          <w:szCs w:val="24"/>
+          <w:u w:val="none"/>
+          <w:vertAlign w:val="baseline"/>
+          <w:lang w:val="en-US" w:eastAsia="en-US" w:bidi="ar-SA"/>
+        </w:rPr>
+        <w:t xml:space="preserve"> Επίσης τα όρια του z προκύπτουν από τις διαστάσεις τις δοθείσας σκακιέρας, διότι το  x</w:t>
+      </w:r>
+      <w:r>
+        <w:rPr>
+          <w:rFonts w:eastAsia="Arial" w:cs="" w:ascii="Calibri" w:hAnsi="Calibri" w:cstheme="minorBidi"/>
+          <w:b w:val="false"/>
+          <w:bCs w:val="false"/>
+          <w:color w:val="000000"/>
+          <w:kern w:val="0"/>
+          <w:sz w:val="24"/>
+          <w:szCs w:val="24"/>
+          <w:u w:val="none"/>
+          <w:vertAlign w:val="subscript"/>
+          <w:lang w:val="en-US" w:eastAsia="en-US" w:bidi="ar-SA"/>
+        </w:rPr>
+        <w:t>σ</w:t>
+      </w:r>
+      <w:r>
+        <w:rPr>
+          <w:rFonts w:eastAsia="Arial" w:cs="" w:ascii="Calibri" w:hAnsi="Calibri" w:cstheme="minorBidi"/>
+          <w:b w:val="false"/>
+          <w:bCs w:val="false"/>
+          <w:color w:val="000000"/>
+          <w:kern w:val="0"/>
+          <w:position w:val="0"/>
+          <w:sz w:val="24"/>
+          <w:sz w:val="24"/>
+          <w:szCs w:val="24"/>
+          <w:u w:val="none"/>
+          <w:vertAlign w:val="baseline"/>
+          <w:lang w:val="en-US" w:eastAsia="en-US" w:bidi="ar-SA"/>
+        </w:rPr>
+        <w:t xml:space="preserve"> αντιστοιχεί στο z του βραχίονα.</w:t>
+      </w:r>
+    </w:p>
+    <w:p>
+      <w:pPr>
+        <w:pStyle w:val="Normal"/>
+        <w:spacing w:before="0" w:after="200"/>
+        <w:ind w:left="720" w:hanging="0"/>
+        <w:jc w:val="left"/>
+        <w:rPr>
+          <w:b w:val="false"/>
+          <w:b w:val="false"/>
+          <w:bCs w:val="false"/>
+          <w:color w:val="000000"/>
+          <w:position w:val="0"/>
+          <w:sz w:val="24"/>
+          <w:sz w:val="24"/>
+          <w:szCs w:val="24"/>
+          <w:u w:val="none"/>
+          <w:vertAlign w:val="baseline"/>
+        </w:rPr>
+      </w:pPr>
+      <w:r>
+        <w:rPr/>
+      </w:r>
+    </w:p>
+    <w:p>
+      <w:pPr>
+        <w:pStyle w:val="Normal"/>
+        <w:spacing w:before="0" w:after="200"/>
+        <w:ind w:left="720" w:hanging="0"/>
+        <w:jc w:val="left"/>
+        <w:rPr>
+          <w:b w:val="false"/>
+          <w:b w:val="false"/>
+          <w:bCs w:val="false"/>
+          <w:color w:val="000000"/>
+          <w:position w:val="0"/>
+          <w:sz w:val="24"/>
+          <w:sz w:val="24"/>
+          <w:szCs w:val="24"/>
+          <w:u w:val="none"/>
+          <w:vertAlign w:val="baseline"/>
+        </w:rPr>
+      </w:pPr>
+      <w:r>
+        <w:rPr/>
       </w:r>
     </w:p>
     <w:sectPr>
@@ -9782,6 +9814,13 @@
       <w:bCs/>
     </w:rPr>
   </w:style>
+  <w:style w:type="paragraph" w:styleId="FrameContents">
+    <w:name w:val="Frame Contents"/>
+    <w:basedOn w:val="Normal"/>
+    <w:qFormat/>
+    <w:pPr/>
+    <w:rPr/>
+  </w:style>
   <w:style w:type="numbering" w:styleId="NoList" w:default="1">
     <w:name w:val="No List"/>
     <w:uiPriority w:val="99"/>

</xml_diff>

<commit_message>
experimenitng with kinematics + theory
</commit_message>
<xml_diff>
--- a/KinematicsAndCoordinates/kinematcis_coordinates.docx
+++ b/KinematicsAndCoordinates/kinematcis_coordinates.docx
@@ -477,7 +477,11 @@
       </w:pPr>
       <w:r>
         <w:rPr/>
-        <w:t>Για τη μετακίνηση αντικειμένων είναι απαραίτητο, με σκοπό να αρπάζει ο βραχίονας τα αντικείμενα από πάνω προς τα κάτω.</w:t>
+        <w:t>Μ</w:t>
+      </w:r>
+      <w:r>
+        <w:rPr/>
+        <w:t>ε σκοπό να αρπάζει ο βραχίονας τα αντικείμενα από πάνω προς τα κάτω.</w:t>
       </w:r>
     </w:p>
     <w:p>
@@ -527,7 +531,21 @@
       </w:pPr>
       <w:r>
         <w:rPr/>
-        <w:t>x′ = x − L₃ cosφ=x+L3</w:t>
+        <w:t>x′ = x − L₃ cosφ=x+L3*</w:t>
+      </w:r>
+      <w:r>
+        <w:rPr/>
+        <w:t>cos(-90</w:t>
+      </w:r>
+      <w:r>
+        <w:rPr>
+          <w:vertAlign w:val="superscript"/>
+        </w:rPr>
+        <w:t>o</w:t>
+      </w:r>
+      <w:r>
+        <w:rPr/>
+        <w:t>)=x</w:t>
       </w:r>
     </w:p>
     <w:p>
@@ -537,7 +555,25 @@
       </w:pPr>
       <w:r>
         <w:rPr/>
-        <w:t>y′ = y − L₃ sinφ=y</w:t>
+        <w:t>y′ = y − L₃ sinφ=y-</w:t>
+      </w:r>
+      <w:r>
+        <w:rPr/>
+        <w:t>L3*sin(-90</w:t>
+      </w:r>
+      <w:r>
+        <w:rPr>
+          <w:vertAlign w:val="superscript"/>
+        </w:rPr>
+        <w:t>o</w:t>
+      </w:r>
+      <w:r>
+        <w:rPr>
+          <w:position w:val="0"/>
+          <w:sz w:val="26"/>
+          <w:vertAlign w:val="baseline"/>
+        </w:rPr>
+        <w:t>)=y-L3*(-1)=y+L3</w:t>
       </w:r>
     </w:p>
     <w:p>
@@ -1321,7 +1357,7 @@
                 <wp:positionV relativeFrom="paragraph">
                   <wp:posOffset>57150</wp:posOffset>
                 </wp:positionV>
-                <wp:extent cx="3748405" cy="6054725"/>
+                <wp:extent cx="3747770" cy="6054090"/>
                 <wp:effectExtent l="0" t="0" r="0" b="0"/>
                 <wp:wrapNone/>
                 <wp:docPr id="3" name="Group object 1"/>
@@ -1332,9 +1368,9 @@
                       <wpg:grpSpPr>
                         <a:xfrm>
                           <a:off x="0" y="0"/>
-                          <a:ext cx="3748320" cy="6054840"/>
+                          <a:ext cx="3747600" cy="6054120"/>
                           <a:chOff x="0" y="0"/>
-                          <a:chExt cx="3748320" cy="6054840"/>
+                          <a:chExt cx="3747600" cy="6054120"/>
                         </a:xfrm>
                       </wpg:grpSpPr>
                       <pic:pic xmlns:pic="http://schemas.openxmlformats.org/drawingml/2006/picture">
@@ -1349,7 +1385,7 @@
                         <pic:spPr>
                           <a:xfrm>
                             <a:off x="546120" y="0"/>
-                            <a:ext cx="3174480" cy="2910960"/>
+                            <a:ext cx="3173760" cy="2910240"/>
                           </a:xfrm>
                           <a:prstGeom prst="rect">
                             <a:avLst/>
@@ -1371,7 +1407,7 @@
                         <pic:spPr>
                           <a:xfrm>
                             <a:off x="0" y="1440"/>
-                            <a:ext cx="458640" cy="2909520"/>
+                            <a:ext cx="457920" cy="2908800"/>
                           </a:xfrm>
                           <a:prstGeom prst="rect">
                             <a:avLst/>
@@ -1393,7 +1429,7 @@
                         <pic:spPr>
                           <a:xfrm>
                             <a:off x="561240" y="2959200"/>
-                            <a:ext cx="3187080" cy="363240"/>
+                            <a:ext cx="3186360" cy="362520"/>
                           </a:xfrm>
                           <a:prstGeom prst="rect">
                             <a:avLst/>
@@ -1462,7 +1498,7 @@
                         <wps:spPr>
                           <a:xfrm>
                             <a:off x="650160" y="2682720"/>
-                            <a:ext cx="139680" cy="112320"/>
+                            <a:ext cx="138960" cy="111600"/>
                           </a:xfrm>
                           <a:prstGeom prst="ellipse">
                             <a:avLst/>
@@ -1514,7 +1550,7 @@
                         <wps:spPr>
                           <a:xfrm>
                             <a:off x="6480" y="3381480"/>
-                            <a:ext cx="1641960" cy="2673360"/>
+                            <a:ext cx="1641600" cy="2672640"/>
                           </a:xfrm>
                           <a:prstGeom prst="rect">
                             <a:avLst/>
@@ -1564,7 +1600,7 @@
                             </w:p>
                           </w:txbxContent>
                         </wps:txbx>
-                        <wps:bodyPr lIns="90000" rIns="90000" tIns="2674800" bIns="2674800" anchor="t">
+                        <wps:bodyPr lIns="90000" rIns="90000" tIns="2673360" bIns="2673360" anchor="t">
                           <a:noAutofit/>
                         </wps:bodyPr>
                       </wps:wsp>
@@ -1576,7 +1612,7 @@
           </mc:Choice>
           <mc:Fallback>
             <w:pict>
-              <v:group id="shape_0" alt="Group object 1" style="position:absolute;margin-left:259.8pt;margin-top:4.5pt;width:295.15pt;height:476.75pt" coordorigin="5196,90" coordsize="5903,9535">
+              <v:group id="shape_0" alt="Group object 1" style="position:absolute;margin-left:259.8pt;margin-top:4.5pt;width:295.1pt;height:476.75pt" coordorigin="5196,90" coordsize="5902,9535">
                 <v:shapetype id="_x0000_t75" coordsize="21600,21600" o:spt="75" o:preferrelative="t" path="m@4@5l@4@11@9@11@9@5xe" filled="f" stroked="f">
                   <v:stroke joinstyle="miter"/>
                   <v:formulas>
@@ -1596,17 +1632,17 @@
                   <v:path o:extrusionok="f" gradientshapeok="t" o:connecttype="rect"/>
                   <o:lock v:ext="edit" aspectratio="t"/>
                 </v:shapetype>
-                <v:shape id="shape_0" stroked="f" o:allowincell="f" style="position:absolute;left:6056;top:90;width:4998;height:4583;mso-wrap-style:none;v-text-anchor:middle" type="_x0000_t75">
+                <v:shape id="shape_0" stroked="f" o:allowincell="f" style="position:absolute;left:6056;top:90;width:4997;height:4582;mso-wrap-style:none;v-text-anchor:middle" type="_x0000_t75">
                   <v:imagedata r:id="rId4" o:detectmouseclick="t"/>
                   <v:stroke color="#3465a4" joinstyle="round" endcap="flat"/>
                   <w10:wrap type="none"/>
                 </v:shape>
-                <v:shape id="shape_0" stroked="f" o:allowincell="f" style="position:absolute;left:5196;top:92;width:721;height:4581;mso-wrap-style:none;v-text-anchor:middle" type="_x0000_t75">
+                <v:shape id="shape_0" stroked="f" o:allowincell="f" style="position:absolute;left:5196;top:92;width:720;height:4580;mso-wrap-style:none;v-text-anchor:middle" type="_x0000_t75">
                   <v:imagedata r:id="rId5" o:detectmouseclick="t"/>
                   <v:stroke color="#3465a4" joinstyle="round" endcap="flat"/>
                   <w10:wrap type="none"/>
                 </v:shape>
-                <v:shape id="shape_0" stroked="f" o:allowincell="f" style="position:absolute;left:6080;top:4750;width:5018;height:571;mso-wrap-style:none;v-text-anchor:middle" type="_x0000_t75">
+                <v:shape id="shape_0" stroked="f" o:allowincell="f" style="position:absolute;left:6080;top:4750;width:5017;height:570;mso-wrap-style:none;v-text-anchor:middle" type="_x0000_t75">
                   <v:imagedata r:id="rId6" o:detectmouseclick="t"/>
                   <v:stroke color="#3465a4" joinstyle="round" endcap="flat"/>
                   <w10:wrap type="none"/>
@@ -1621,7 +1657,7 @@
                   <v:fill o:detectmouseclick="t" on="false"/>
                   <w10:wrap type="none"/>
                 </v:line>
-                <v:oval id="shape_0" path="l-2147483648,-2147483643l-2147483628,-2147483627l-2147483648,-2147483643l-2147483626,-2147483625xe" fillcolor="black" stroked="t" o:allowincell="f" style="position:absolute;left:6220;top:4315;width:219;height:176;mso-wrap-style:none;v-text-anchor:middle">
+                <v:oval id="shape_0" path="l-2147483648,-2147483643l-2147483628,-2147483627l-2147483648,-2147483643l-2147483626,-2147483625xe" fillcolor="black" stroked="t" o:allowincell="f" style="position:absolute;left:6220;top:4315;width:218;height:175;mso-wrap-style:none;v-text-anchor:middle">
                   <v:fill o:detectmouseclick="t" type="solid" color2="white"/>
                   <v:stroke color="#3465a4" joinstyle="round" endcap="flat"/>
                   <w10:wrap type="none"/>
@@ -1631,7 +1667,7 @@
                   <v:fill o:detectmouseclick="t" on="false"/>
                   <w10:wrap type="none"/>
                 </v:line>
-                <v:rect id="shape_0" path="m0,0l-2147483645,0l-2147483645,-2147483646l0,-2147483646xe" stroked="f" o:allowincell="f" style="position:absolute;left:5206;top:5415;width:2585;height:4209;mso-wrap-style:square;v-text-anchor:top">
+                <v:rect id="shape_0" path="m0,0l-2147483645,0l-2147483645,-2147483646l0,-2147483646xe" stroked="f" o:allowincell="f" style="position:absolute;left:5206;top:5415;width:2584;height:4208;mso-wrap-style:square;v-text-anchor:top">
                   <v:textbox>
                     <w:txbxContent>
                       <w:p>
@@ -4722,7 +4758,7 @@
                         <wps:spPr>
                           <a:xfrm>
                             <a:off x="1991880" y="3535200"/>
-                            <a:ext cx="378000" cy="391320"/>
+                            <a:ext cx="377280" cy="390600"/>
                           </a:xfrm>
                           <a:prstGeom prst="ellipse">
                             <a:avLst/>
@@ -4749,7 +4785,7 @@
                         <wps:spPr>
                           <a:xfrm>
                             <a:off x="569520" y="981720"/>
-                            <a:ext cx="472320" cy="391680"/>
+                            <a:ext cx="471960" cy="391320"/>
                           </a:xfrm>
                           <a:prstGeom prst="rect">
                             <a:avLst/>
@@ -4776,7 +4812,7 @@
                         <wps:spPr>
                           <a:xfrm>
                             <a:off x="3129840" y="1767960"/>
-                            <a:ext cx="473760" cy="391320"/>
+                            <a:ext cx="473040" cy="390600"/>
                           </a:xfrm>
                           <a:prstGeom prst="rect">
                             <a:avLst/>
@@ -4880,7 +4916,7 @@
                         <wps:spPr>
                           <a:xfrm>
                             <a:off x="1927800" y="3069720"/>
-                            <a:ext cx="281880" cy="182880"/>
+                            <a:ext cx="281160" cy="182160"/>
                           </a:xfrm>
                           <a:custGeom>
                             <a:avLst/>
@@ -4920,7 +4956,7 @@
                         <wps:spPr>
                           <a:xfrm>
                             <a:off x="2187000" y="3189600"/>
-                            <a:ext cx="340920" cy="160560"/>
+                            <a:ext cx="340200" cy="160200"/>
                           </a:xfrm>
                           <a:custGeom>
                             <a:avLst/>
@@ -5017,7 +5053,7 @@
                         <wps:spPr>
                           <a:xfrm>
                             <a:off x="1897560" y="2847240"/>
-                            <a:ext cx="93240" cy="674280"/>
+                            <a:ext cx="92880" cy="673560"/>
                           </a:xfrm>
                           <a:prstGeom prst="rect">
                             <a:avLst/>
@@ -5067,7 +5103,7 @@
                             </w:p>
                           </w:txbxContent>
                         </wps:txbx>
-                        <wps:bodyPr lIns="90000" rIns="90000" tIns="279360" bIns="279360" anchor="t">
+                        <wps:bodyPr lIns="90000" rIns="90000" tIns="674640" bIns="674640" anchor="t">
                           <a:noAutofit/>
                         </wps:bodyPr>
                       </wps:wsp>
@@ -5076,7 +5112,7 @@
                         <wps:spPr>
                           <a:xfrm>
                             <a:off x="2276640" y="2847240"/>
-                            <a:ext cx="187920" cy="674280"/>
+                            <a:ext cx="187200" cy="673560"/>
                           </a:xfrm>
                           <a:prstGeom prst="rect">
                             <a:avLst/>
@@ -5126,7 +5162,7 @@
                             </w:p>
                           </w:txbxContent>
                         </wps:txbx>
-                        <wps:bodyPr lIns="90000" rIns="90000" tIns="279360" bIns="279360" anchor="t">
+                        <wps:bodyPr lIns="90000" rIns="90000" tIns="674640" bIns="674640" anchor="t">
                           <a:noAutofit/>
                         </wps:bodyPr>
                       </wps:wsp>
@@ -5135,7 +5171,7 @@
                         <wps:spPr>
                           <a:xfrm>
                             <a:off x="2276640" y="2455560"/>
-                            <a:ext cx="187920" cy="674280"/>
+                            <a:ext cx="187200" cy="673560"/>
                           </a:xfrm>
                           <a:prstGeom prst="rect">
                             <a:avLst/>
@@ -5185,7 +5221,7 @@
                             </w:p>
                           </w:txbxContent>
                         </wps:txbx>
-                        <wps:bodyPr lIns="90000" rIns="90000" tIns="279360" bIns="279360" anchor="t">
+                        <wps:bodyPr lIns="90000" rIns="90000" tIns="674640" bIns="674640" anchor="t">
                           <a:noAutofit/>
                         </wps:bodyPr>
                       </wps:wsp>
@@ -5194,7 +5230,7 @@
                         <wps:spPr>
                           <a:xfrm>
                             <a:off x="2656080" y="1669320"/>
-                            <a:ext cx="188640" cy="674280"/>
+                            <a:ext cx="187920" cy="673560"/>
                           </a:xfrm>
                           <a:prstGeom prst="rect">
                             <a:avLst/>
@@ -5244,7 +5280,7 @@
                             </w:p>
                           </w:txbxContent>
                         </wps:txbx>
-                        <wps:bodyPr lIns="90000" rIns="90000" tIns="279360" bIns="279360" anchor="t">
+                        <wps:bodyPr lIns="90000" rIns="90000" tIns="674640" bIns="674640" anchor="t">
                           <a:noAutofit/>
                         </wps:bodyPr>
                       </wps:wsp>
@@ -5282,7 +5318,7 @@
                         <wps:spPr>
                           <a:xfrm>
                             <a:off x="569520" y="2061720"/>
-                            <a:ext cx="282600" cy="675000"/>
+                            <a:ext cx="281880" cy="674280"/>
                           </a:xfrm>
                           <a:prstGeom prst="rect">
                             <a:avLst/>
@@ -5332,7 +5368,7 @@
                             </w:p>
                           </w:txbxContent>
                         </wps:txbx>
-                        <wps:bodyPr lIns="90000" rIns="90000" tIns="279360" bIns="279360" anchor="t">
+                        <wps:bodyPr lIns="90000" rIns="90000" tIns="675360" bIns="675360" anchor="t">
                           <a:noAutofit/>
                         </wps:bodyPr>
                       </wps:wsp>
@@ -5341,7 +5377,7 @@
                         <wps:spPr>
                           <a:xfrm>
                             <a:off x="1517760" y="882720"/>
-                            <a:ext cx="187920" cy="675000"/>
+                            <a:ext cx="187200" cy="674280"/>
                           </a:xfrm>
                           <a:prstGeom prst="rect">
                             <a:avLst/>
@@ -5391,7 +5427,7 @@
                             </w:p>
                           </w:txbxContent>
                         </wps:txbx>
-                        <wps:bodyPr lIns="90000" rIns="90000" tIns="279360" bIns="279360" anchor="t">
+                        <wps:bodyPr lIns="90000" rIns="90000" tIns="675360" bIns="675360" anchor="t">
                           <a:noAutofit/>
                         </wps:bodyPr>
                       </wps:wsp>
@@ -5409,17 +5445,17 @@
                   <v:fill o:detectmouseclick="t" on="false"/>
                   <w10:wrap type="none"/>
                 </v:line>
-                <v:oval id="shape_0" path="l-2147483648,-2147483643l-2147483628,-2147483627l-2147483648,-2147483643l-2147483626,-2147483625xe" fillcolor="#729fcf" stroked="t" o:allowincell="f" style="position:absolute;left:4508;top:5506;width:594;height:615;mso-wrap-style:none;v-text-anchor:middle">
+                <v:oval id="shape_0" path="l-2147483648,-2147483643l-2147483628,-2147483627l-2147483648,-2147483643l-2147483626,-2147483625xe" fillcolor="#729fcf" stroked="t" o:allowincell="f" style="position:absolute;left:4508;top:5506;width:593;height:614;mso-wrap-style:none;v-text-anchor:middle">
                   <v:fill o:detectmouseclick="t" type="solid" color2="#8d6030"/>
                   <v:stroke color="black" joinstyle="round" endcap="flat"/>
                   <w10:wrap type="none"/>
                 </v:oval>
-                <v:rect id="shape_0" path="m0,0l-2147483645,0l-2147483645,-2147483646l0,-2147483646xe" fillcolor="black" stroked="t" o:allowincell="f" style="position:absolute;left:2268;top:1485;width:743;height:616;mso-wrap-style:none;v-text-anchor:middle">
+                <v:rect id="shape_0" path="m0,0l-2147483645,0l-2147483645,-2147483646l0,-2147483646xe" fillcolor="black" stroked="t" o:allowincell="f" style="position:absolute;left:2268;top:1485;width:742;height:615;mso-wrap-style:none;v-text-anchor:middle">
                   <v:fill o:detectmouseclick="t" type="solid" color2="white"/>
                   <v:stroke color="white" joinstyle="round" endcap="flat"/>
                   <w10:wrap type="none"/>
                 </v:rect>
-                <v:rect id="shape_0" path="m0,0l-2147483645,0l-2147483645,-2147483646l0,-2147483646xe" fillcolor="white" stroked="t" o:allowincell="f" style="position:absolute;left:6300;top:2723;width:745;height:615;mso-wrap-style:none;v-text-anchor:middle">
+                <v:rect id="shape_0" path="m0,0l-2147483645,0l-2147483645,-2147483646l0,-2147483646xe" fillcolor="white" stroked="t" o:allowincell="f" style="position:absolute;left:6300;top:2723;width:744;height:614;mso-wrap-style:none;v-text-anchor:middle">
                   <v:fill o:detectmouseclick="t" type="solid" color2="black"/>
                   <v:stroke color="black" joinstyle="round" endcap="flat"/>
                   <w10:wrap type="none"/>
@@ -5449,7 +5485,7 @@
                   <v:fill o:detectmouseclick="t" on="false"/>
                   <w10:wrap type="none"/>
                 </v:line>
-                <v:rect id="shape_0" path="m0,0l-2147483645,0l-2147483645,-2147483646l0,-2147483646xe" stroked="f" o:allowincell="f" style="position:absolute;left:4359;top:4423;width:146;height:1061;mso-wrap-style:square;v-text-anchor:top">
+                <v:rect id="shape_0" path="m0,0l-2147483645,0l-2147483645,-2147483646l0,-2147483646xe" stroked="f" o:allowincell="f" style="position:absolute;left:4359;top:4423;width:145;height:1060;mso-wrap-style:square;v-text-anchor:top">
                   <v:textbox>
                     <w:txbxContent>
                       <w:p>
@@ -5488,7 +5524,7 @@
                   <v:stroke color="#3465a4" joinstyle="round" endcap="flat"/>
                   <w10:wrap type="none"/>
                 </v:rect>
-                <v:rect id="shape_0" path="m0,0l-2147483645,0l-2147483645,-2147483646l0,-2147483646xe" stroked="f" o:allowincell="f" style="position:absolute;left:4956;top:4423;width:295;height:1061;mso-wrap-style:square;v-text-anchor:top">
+                <v:rect id="shape_0" path="m0,0l-2147483645,0l-2147483645,-2147483646l0,-2147483646xe" stroked="f" o:allowincell="f" style="position:absolute;left:4956;top:4423;width:294;height:1060;mso-wrap-style:square;v-text-anchor:top">
                   <v:textbox>
                     <w:txbxContent>
                       <w:p>
@@ -5527,7 +5563,7 @@
                   <v:stroke color="#3465a4" joinstyle="round" endcap="flat"/>
                   <w10:wrap type="none"/>
                 </v:rect>
-                <v:rect id="shape_0" path="m0,0l-2147483645,0l-2147483645,-2147483646l0,-2147483646xe" stroked="f" o:allowincell="f" style="position:absolute;left:4956;top:3806;width:295;height:1061;mso-wrap-style:square;v-text-anchor:top">
+                <v:rect id="shape_0" path="m0,0l-2147483645,0l-2147483645,-2147483646l0,-2147483646xe" stroked="f" o:allowincell="f" style="position:absolute;left:4956;top:3806;width:294;height:1060;mso-wrap-style:square;v-text-anchor:top">
                   <v:textbox>
                     <w:txbxContent>
                       <w:p>
@@ -5566,7 +5602,7 @@
                   <v:stroke color="#3465a4" joinstyle="round" endcap="flat"/>
                   <w10:wrap type="none"/>
                 </v:rect>
-                <v:rect id="shape_0" path="m0,0l-2147483645,0l-2147483645,-2147483646l0,-2147483646xe" stroked="f" o:allowincell="f" style="position:absolute;left:5554;top:2568;width:296;height:1061;mso-wrap-style:square;v-text-anchor:top">
+                <v:rect id="shape_0" path="m0,0l-2147483645,0l-2147483645,-2147483646l0,-2147483646xe" stroked="f" o:allowincell="f" style="position:absolute;left:5554;top:2568;width:295;height:1060;mso-wrap-style:square;v-text-anchor:top">
                   <v:textbox>
                     <w:txbxContent>
                       <w:p>
@@ -5610,7 +5646,7 @@
                   <v:fill o:detectmouseclick="t" on="false"/>
                   <w10:wrap type="none"/>
                 </v:line>
-                <v:rect id="shape_0" path="m0,0l-2147483645,0l-2147483645,-2147483646l0,-2147483646xe" stroked="f" o:allowincell="f" style="position:absolute;left:2268;top:3186;width:444;height:1062;mso-wrap-style:square;v-text-anchor:top">
+                <v:rect id="shape_0" path="m0,0l-2147483645,0l-2147483645,-2147483646l0,-2147483646xe" stroked="f" o:allowincell="f" style="position:absolute;left:2268;top:3186;width:443;height:1061;mso-wrap-style:square;v-text-anchor:top">
                   <v:textbox>
                     <w:txbxContent>
                       <w:p>
@@ -5649,7 +5685,7 @@
                   <v:stroke color="#3465a4" joinstyle="round" endcap="flat"/>
                   <w10:wrap type="none"/>
                 </v:rect>
-                <v:rect id="shape_0" path="m0,0l-2147483645,0l-2147483645,-2147483646l0,-2147483646xe" stroked="f" o:allowincell="f" style="position:absolute;left:3761;top:1329;width:295;height:1062;mso-wrap-style:square;v-text-anchor:top">
+                <v:rect id="shape_0" path="m0,0l-2147483645,0l-2147483645,-2147483646l0,-2147483646xe" stroked="f" o:allowincell="f" style="position:absolute;left:3761;top:1329;width:294;height:1061;mso-wrap-style:square;v-text-anchor:top">
                   <v:textbox>
                     <w:txbxContent>
                       <w:p>
@@ -5735,7 +5771,7 @@
                           <w:p>
                             <w:pPr>
                               <w:pStyle w:val="FrameContents"/>
-                              <w:overflowPunct w:val="false"/>
+                              <w:overflowPunct w:val="true"/>
                               <w:spacing w:lineRule="auto" w:line="240" w:before="0" w:after="0"/>
                               <w:rPr>
                                 <w:color w:val="000000"/>
@@ -5791,7 +5827,7 @@
                     <w:p>
                       <w:pPr>
                         <w:pStyle w:val="FrameContents"/>
-                        <w:overflowPunct w:val="false"/>
+                        <w:overflowPunct w:val="true"/>
                         <w:spacing w:lineRule="auto" w:line="240" w:before="0" w:after="0"/>
                         <w:rPr>
                           <w:color w:val="000000"/>
@@ -5876,7 +5912,7 @@
                           <w:p>
                             <w:pPr>
                               <w:pStyle w:val="FrameContents"/>
-                              <w:overflowPunct w:val="false"/>
+                              <w:overflowPunct w:val="true"/>
                               <w:spacing w:lineRule="auto" w:line="240" w:before="0" w:after="0"/>
                               <w:rPr>
                                 <w:color w:val="000000"/>
@@ -5935,7 +5971,7 @@
                     <w:p>
                       <w:pPr>
                         <w:pStyle w:val="FrameContents"/>
-                        <w:overflowPunct w:val="false"/>
+                        <w:overflowPunct w:val="true"/>
                         <w:spacing w:lineRule="auto" w:line="240" w:before="0" w:after="0"/>
                         <w:rPr>
                           <w:color w:val="000000"/>
@@ -7537,24 +7573,7 @@
           <w:vertAlign w:val="baseline"/>
           <w:lang w:val="en-US" w:eastAsia="en-US" w:bidi="ar-SA"/>
         </w:rPr>
-        <w:t>τεταρτημόριο.</w:t>
-      </w:r>
-      <w:r>
-        <w:rPr>
-          <w:rFonts w:eastAsia="Arial" w:cs="" w:ascii="Calibri" w:hAnsi="Calibri" w:cstheme="minorBidi"/>
-          <w:b w:val="false"/>
-          <w:bCs w:val="false"/>
-          <w:color w:val="000000"/>
-          <w:kern w:val="0"/>
-          <w:position w:val="0"/>
-          <w:sz w:val="24"/>
-          <w:sz w:val="24"/>
-          <w:szCs w:val="24"/>
-          <w:u w:val="none"/>
-          <w:vertAlign w:val="baseline"/>
-          <w:lang w:val="en-US" w:eastAsia="en-US" w:bidi="ar-SA"/>
-        </w:rPr>
-        <w:t xml:space="preserve"> Επίσης τα όρια του z προκύπτουν από τις διαστάσεις τις δοθείσας σκακιέρας, διότι το  x</w:t>
+        <w:t>τεταρτημόριο. Επίσης τα όρια του z προκύπτουν από τις διαστάσεις τις δοθείσας σκακιέρας, διότι το  x</w:t>
       </w:r>
       <w:r>
         <w:rPr>
@@ -7609,7 +7628,17 @@
         </w:rPr>
       </w:pPr>
       <w:r>
-        <w:rPr/>
+        <w:rPr>
+          <w:b w:val="false"/>
+          <w:bCs w:val="false"/>
+          <w:color w:val="000000"/>
+          <w:position w:val="0"/>
+          <w:sz w:val="24"/>
+          <w:sz w:val="24"/>
+          <w:szCs w:val="24"/>
+          <w:u w:val="none"/>
+          <w:vertAlign w:val="baseline"/>
+        </w:rPr>
       </w:r>
     </w:p>
     <w:p>

</xml_diff>